<commit_message>
word-to-dtbook: rework blocks opening and closing and bookmarks handling
- Add a new stack and templates to manage opening and closing of
  structural elements (levels, paragraphs and intermediate content
  blocks). This should limit wrongly inserted closing blocks and
  paragraphs by first checking if the element was opened somewhere in
  the stack. The stack also allows to more correctly close sub elements
  when requesting closure of a top level element. (Note that the rework
  is not used yet for some elements like lists.)
- Extract and rework bookmarks handling in new templates.

fixes https://github.com/daisy/word-save-as-daisy/issues/71
fixes https://github.com/daisy/word-save-as-daisy/issues/72
</commit_message>
<xml_diff>
--- a/word-to-dtbook/src/test/resources/Test 11/Input/default_sample_for_dtbook_conversion.docx
+++ b/word-to-dtbook/src/test/resources/Test 11/Input/default_sample_for_dtbook_conversion.docx
@@ -4,7 +4,7 @@
   <w:body>
     <w:p>
       <w:pPr>
-        <w:pStyle w:val="Titre"/>
+        <w:pStyle w:val="Title"/>
         <w:rPr>
           <w:rFonts w:cstheme="majorHAnsi"/>
           <w:lang w:val="en-US"/>
@@ -80,7 +80,7 @@
       <w:sdtContent>
         <w:p>
           <w:pPr>
-            <w:pStyle w:val="En-ttedetabledesmatires"/>
+            <w:pStyle w:val="TOCHeading"/>
             <w:rPr>
               <w:lang w:val="en-US"/>
             </w:rPr>
@@ -94,7 +94,7 @@
         </w:p>
         <w:p>
           <w:pPr>
-            <w:pStyle w:val="TM1"/>
+            <w:pStyle w:val="TOC1"/>
             <w:tabs>
               <w:tab w:val="right" w:leader="dot" w:pos="9062"/>
             </w:tabs>
@@ -125,7 +125,7 @@
           <w:hyperlink w:anchor="_Toc103675404" w:history="1">
             <w:r>
               <w:rPr>
-                <w:rStyle w:val="Lienhypertexte"/>
+                <w:rStyle w:val="Hyperlink"/>
                 <w:noProof/>
                 <w:lang w:val="en-US"/>
               </w:rPr>
@@ -190,7 +190,7 @@
         </w:p>
         <w:p>
           <w:pPr>
-            <w:pStyle w:val="TM2"/>
+            <w:pStyle w:val="TOC2"/>
             <w:tabs>
               <w:tab w:val="right" w:leader="dot" w:pos="9062"/>
             </w:tabs>
@@ -203,7 +203,7 @@
           <w:hyperlink w:anchor="_Toc103675405" w:history="1">
             <w:r>
               <w:rPr>
-                <w:rStyle w:val="Lienhypertexte"/>
+                <w:rStyle w:val="Hyperlink"/>
                 <w:noProof/>
                 <w:lang w:val="en-US"/>
               </w:rPr>
@@ -268,7 +268,7 @@
         </w:p>
         <w:p>
           <w:pPr>
-            <w:pStyle w:val="TM2"/>
+            <w:pStyle w:val="TOC2"/>
             <w:tabs>
               <w:tab w:val="right" w:leader="dot" w:pos="9062"/>
             </w:tabs>
@@ -281,7 +281,7 @@
           <w:hyperlink w:anchor="_Toc103675406" w:history="1">
             <w:r>
               <w:rPr>
-                <w:rStyle w:val="Lienhypertexte"/>
+                <w:rStyle w:val="Hyperlink"/>
                 <w:noProof/>
                 <w:lang w:val="en-US"/>
               </w:rPr>
@@ -346,7 +346,7 @@
         </w:p>
         <w:p>
           <w:pPr>
-            <w:pStyle w:val="TM2"/>
+            <w:pStyle w:val="TOC2"/>
             <w:tabs>
               <w:tab w:val="right" w:leader="dot" w:pos="9062"/>
             </w:tabs>
@@ -359,7 +359,7 @@
           <w:hyperlink w:anchor="_Toc103675407" w:history="1">
             <w:r>
               <w:rPr>
-                <w:rStyle w:val="Lienhypertexte"/>
+                <w:rStyle w:val="Hyperlink"/>
                 <w:noProof/>
                 <w:lang w:val="en-US"/>
               </w:rPr>
@@ -424,7 +424,7 @@
         </w:p>
         <w:p>
           <w:pPr>
-            <w:pStyle w:val="TM1"/>
+            <w:pStyle w:val="TOC1"/>
             <w:tabs>
               <w:tab w:val="right" w:leader="dot" w:pos="9062"/>
             </w:tabs>
@@ -437,7 +437,7 @@
           <w:hyperlink w:anchor="_Toc103675408" w:history="1">
             <w:r>
               <w:rPr>
-                <w:rStyle w:val="Lienhypertexte"/>
+                <w:rStyle w:val="Hyperlink"/>
                 <w:noProof/>
                 <w:lang w:val="en-US"/>
               </w:rPr>
@@ -502,7 +502,7 @@
         </w:p>
         <w:p>
           <w:pPr>
-            <w:pStyle w:val="TM2"/>
+            <w:pStyle w:val="TOC2"/>
             <w:tabs>
               <w:tab w:val="right" w:leader="dot" w:pos="9062"/>
             </w:tabs>
@@ -515,7 +515,7 @@
           <w:hyperlink w:anchor="_Toc103675409" w:history="1">
             <w:r>
               <w:rPr>
-                <w:rStyle w:val="Lienhypertexte"/>
+                <w:rStyle w:val="Hyperlink"/>
                 <w:noProof/>
                 <w:lang w:val="en-US"/>
               </w:rPr>
@@ -580,7 +580,7 @@
         </w:p>
         <w:p>
           <w:pPr>
-            <w:pStyle w:val="TM2"/>
+            <w:pStyle w:val="TOC2"/>
             <w:tabs>
               <w:tab w:val="right" w:leader="dot" w:pos="9062"/>
             </w:tabs>
@@ -593,7 +593,7 @@
           <w:hyperlink w:anchor="_Toc103675410" w:history="1">
             <w:r>
               <w:rPr>
-                <w:rStyle w:val="Lienhypertexte"/>
+                <w:rStyle w:val="Hyperlink"/>
                 <w:noProof/>
                 <w:lang w:val="en-US"/>
               </w:rPr>
@@ -658,7 +658,7 @@
         </w:p>
         <w:p>
           <w:pPr>
-            <w:pStyle w:val="TM2"/>
+            <w:pStyle w:val="TOC2"/>
             <w:tabs>
               <w:tab w:val="right" w:leader="dot" w:pos="9062"/>
             </w:tabs>
@@ -671,7 +671,7 @@
           <w:hyperlink w:anchor="_Toc103675411" w:history="1">
             <w:r>
               <w:rPr>
-                <w:rStyle w:val="Lienhypertexte"/>
+                <w:rStyle w:val="Hyperlink"/>
                 <w:noProof/>
                 <w:lang w:val="en-US"/>
               </w:rPr>
@@ -756,7 +756,7 @@
     <w:bookmarkStart w:id="0" w:name="_Toc103675404" w:displacedByCustomXml="prev"/>
     <w:p>
       <w:pPr>
-        <w:pStyle w:val="Titre1"/>
+        <w:pStyle w:val="Heading1"/>
         <w:rPr>
           <w:lang w:val="en-US"/>
         </w:rPr>
@@ -771,7 +771,7 @@
     </w:p>
     <w:p>
       <w:pPr>
-        <w:pStyle w:val="Titre2"/>
+        <w:pStyle w:val="Heading2"/>
         <w:rPr>
           <w:lang w:val="en-US"/>
         </w:rPr>
@@ -1006,7 +1006,7 @@
     </w:p>
     <w:p>
       <w:pPr>
-        <w:pStyle w:val="Titre2"/>
+        <w:pStyle w:val="Heading2"/>
       </w:pPr>
       <w:bookmarkStart w:id="2" w:name="_Toc103675406"/>
       <w:r>
@@ -1068,7 +1068,7 @@
       </w:r>
       <w:r>
         <w:rPr>
-          <w:rStyle w:val="Appelnotedebasdep"/>
+          <w:rStyle w:val="FootnoteReference"/>
           <w:rFonts w:asciiTheme="majorHAnsi" w:hAnsiTheme="majorHAnsi" w:cstheme="majorHAnsi"/>
           <w:lang w:val="en-US"/>
         </w:rPr>
@@ -1112,7 +1112,7 @@
     </w:p>
     <w:p>
       <w:pPr>
-        <w:pStyle w:val="Titre2"/>
+        <w:pStyle w:val="Heading2"/>
         <w:rPr>
           <w:lang w:val="en-US"/>
         </w:rPr>
@@ -1160,7 +1160,7 @@
         </w:rPr>
         <w:t xml:space="preserve"> </w:t>
       </w:r>
-      <w:bookmarkStart w:id="3" w:name="Abbreviations5019654367602899514"/>
+      <w:bookmarkStart w:id="5" w:name="Abbreviations5019654367602899514"/>
       <w:r>
         <w:rPr>
           <w:rFonts w:asciiTheme="majorHAnsi" w:hAnsiTheme="majorHAnsi" w:cstheme="majorHAnsi"/>
@@ -1168,7 +1168,7 @@
         </w:rPr>
         <w:t>etc.</w:t>
       </w:r>
-      <w:bookmarkEnd w:id="3"/>
+      <w:bookmarkEnd w:id="5"/>
       <w:r>
         <w:rPr>
           <w:rFonts w:asciiTheme="majorHAnsi" w:hAnsiTheme="majorHAnsi" w:cstheme="majorHAnsi"/>
@@ -1192,7 +1192,7 @@
         </w:rPr>
         <w:t xml:space="preserve">Or I need to use </w:t>
       </w:r>
-      <w:bookmarkStart w:id="4" w:name="Abbreviations5337448117425534445"/>
+      <w:bookmarkStart w:id="6" w:name="Abbreviations5337448117425534445"/>
       <w:r>
         <w:rPr>
           <w:rFonts w:asciiTheme="majorHAnsi" w:hAnsiTheme="majorHAnsi" w:cstheme="majorHAnsi"/>
@@ -1200,7 +1200,7 @@
         </w:rPr>
         <w:t>etal.</w:t>
       </w:r>
-      <w:bookmarkEnd w:id="4"/>
+      <w:bookmarkEnd w:id="6"/>
       <w:r>
         <w:rPr>
           <w:rFonts w:asciiTheme="majorHAnsi" w:hAnsiTheme="majorHAnsi" w:cstheme="majorHAnsi"/>
@@ -1224,7 +1224,7 @@
         </w:rPr>
         <w:t xml:space="preserve">And then I use it again here: </w:t>
       </w:r>
-      <w:bookmarkStart w:id="5" w:name="Abbreviations4687551102882176760"/>
+      <w:bookmarkStart w:id="7" w:name="Abbreviations4687551102882176760"/>
       <w:r>
         <w:rPr>
           <w:rFonts w:asciiTheme="majorHAnsi" w:hAnsiTheme="majorHAnsi" w:cstheme="majorHAnsi"/>
@@ -1232,7 +1232,7 @@
         </w:rPr>
         <w:t>etal.</w:t>
       </w:r>
-      <w:bookmarkEnd w:id="5"/>
+      <w:bookmarkEnd w:id="7"/>
       <w:r>
         <w:rPr>
           <w:rFonts w:asciiTheme="majorHAnsi" w:hAnsiTheme="majorHAnsi" w:cstheme="majorHAnsi"/>
@@ -1240,7 +1240,7 @@
         </w:rPr>
         <w:t xml:space="preserve"> and </w:t>
       </w:r>
-      <w:bookmarkStart w:id="6" w:name="Abbreviations5377627517227795381"/>
+      <w:bookmarkStart w:id="8" w:name="Abbreviations5377627517227795381"/>
       <w:r>
         <w:rPr>
           <w:rFonts w:asciiTheme="majorHAnsi" w:hAnsiTheme="majorHAnsi" w:cstheme="majorHAnsi"/>
@@ -1248,7 +1248,7 @@
         </w:rPr>
         <w:t>etc.</w:t>
       </w:r>
-      <w:bookmarkEnd w:id="6"/>
+      <w:bookmarkEnd w:id="8"/>
       <w:r>
         <w:rPr>
           <w:rFonts w:asciiTheme="majorHAnsi" w:hAnsiTheme="majorHAnsi" w:cstheme="majorHAnsi"/>
@@ -1272,7 +1272,7 @@
         </w:rPr>
         <w:t xml:space="preserve">Now let use an acronym, like </w:t>
       </w:r>
-      <w:bookmarkStart w:id="7" w:name="AcronymsYes5217018880860573923"/>
+      <w:bookmarkStart w:id="9" w:name="AcronymsYes5217018880860573923"/>
       <w:r>
         <w:rPr>
           <w:rFonts w:asciiTheme="majorHAnsi" w:hAnsiTheme="majorHAnsi" w:cstheme="majorHAnsi"/>
@@ -1280,7 +1280,7 @@
         </w:rPr>
         <w:t>IEEE</w:t>
       </w:r>
-      <w:bookmarkEnd w:id="7"/>
+      <w:bookmarkEnd w:id="9"/>
       <w:r>
         <w:rPr>
           <w:rFonts w:asciiTheme="majorHAnsi" w:hAnsiTheme="majorHAnsi" w:cstheme="majorHAnsi"/>
@@ -1288,7 +1288,7 @@
         </w:rPr>
         <w:t xml:space="preserve"> or </w:t>
       </w:r>
-      <w:bookmarkStart w:id="8" w:name="AcronymsYes4986238613562909951"/>
+      <w:bookmarkStart w:id="10" w:name="AcronymsYes4986238613562909951"/>
       <w:r>
         <w:rPr>
           <w:rFonts w:asciiTheme="majorHAnsi" w:hAnsiTheme="majorHAnsi" w:cstheme="majorHAnsi"/>
@@ -1296,7 +1296,7 @@
         </w:rPr>
         <w:t>DAISY</w:t>
       </w:r>
-      <w:bookmarkEnd w:id="8"/>
+      <w:bookmarkEnd w:id="10"/>
       <w:r>
         <w:rPr>
           <w:rFonts w:asciiTheme="majorHAnsi" w:hAnsiTheme="majorHAnsi" w:cstheme="majorHAnsi"/>
@@ -1304,7 +1304,7 @@
         </w:rPr>
         <w:t xml:space="preserve">, and lets reuse </w:t>
       </w:r>
-      <w:bookmarkStart w:id="9" w:name="AcronymsYes5703539723210207112"/>
+      <w:bookmarkStart w:id="11" w:name="AcronymsYes5703539723210207112"/>
       <w:r>
         <w:rPr>
           <w:rFonts w:asciiTheme="majorHAnsi" w:hAnsiTheme="majorHAnsi" w:cstheme="majorHAnsi"/>
@@ -1312,7 +1312,7 @@
         </w:rPr>
         <w:t>IEEE</w:t>
       </w:r>
-      <w:bookmarkEnd w:id="9"/>
+      <w:bookmarkEnd w:id="11"/>
       <w:r>
         <w:rPr>
           <w:rFonts w:asciiTheme="majorHAnsi" w:hAnsiTheme="majorHAnsi" w:cstheme="majorHAnsi"/>
@@ -1323,7 +1323,62 @@
     </w:p>
     <w:p>
       <w:pPr>
-        <w:pStyle w:val="Titre2"/>
+        <w:pStyle w:val="BlockquoteDAISY"/>
+      </w:pPr>
+      <w:r>
+        <w:t>This is a simple quote</w:t>
+      </w:r>
+      <w:r>
+        <w:t xml:space="preserve"> for testing</w:t>
+      </w:r>
+    </w:p>
+    <w:p>
+      <w:pPr>
+        <w:pStyle w:val="Blockquote-AuthorDAISY"/>
+      </w:pPr>
+      <w:r>
+        <w:t>N.P.</w:t>
+      </w:r>
+    </w:p>
+    <w:p>
+      <w:pPr>
+        <w:pStyle w:val="ListParagraph"/>
+        <w:numPr>
+          <w:ilvl w:val="0"/>
+          <w:numId w:val="1"/>
+        </w:numPr>
+        <w:rPr>
+          <w:lang w:val="sv-SE" w:eastAsia="sv-SE"/>
+        </w:rPr>
+      </w:pPr>
+      <w:r>
+        <w:rPr>
+          <w:lang w:val="sv-SE" w:eastAsia="sv-SE"/>
+        </w:rPr>
+        <w:t>With a list following for a bugfix evaluation</w:t>
+      </w:r>
+    </w:p>
+    <w:p>
+      <w:pPr>
+        <w:pStyle w:val="ListParagraph"/>
+        <w:numPr>
+          <w:ilvl w:val="0"/>
+          <w:numId w:val="1"/>
+        </w:numPr>
+        <w:rPr>
+          <w:lang w:val="sv-SE" w:eastAsia="sv-SE"/>
+        </w:rPr>
+      </w:pPr>
+      <w:r>
+        <w:rPr>
+          <w:lang w:val="sv-SE" w:eastAsia="sv-SE"/>
+        </w:rPr>
+        <w:t>blablabla</w:t>
+      </w:r>
+    </w:p>
+    <w:p>
+      <w:pPr>
+        <w:pStyle w:val="Heading2"/>
         <w:rPr>
           <w:lang w:val="en-US"/>
         </w:rPr>
@@ -1378,6 +1433,7 @@
         <w:pStyle w:val="Sidebarheader-RequiredDAISY"/>
       </w:pPr>
       <w:r>
+        <w:lastRenderedPageBreak/>
         <w:t>This is a head for</w:t>
       </w:r>
     </w:p>
@@ -1418,7 +1474,6 @@
           <w:rFonts w:asciiTheme="majorHAnsi" w:hAnsiTheme="majorHAnsi" w:cstheme="majorHAnsi"/>
           <w:lang w:val="en-US"/>
         </w:rPr>
-        <w:lastRenderedPageBreak/>
         <w:t>A paragraphe</w:t>
       </w:r>
     </w:p>
@@ -1464,12 +1519,12 @@
     </w:p>
     <w:p>
       <w:pPr>
-        <w:pStyle w:val="Titre2"/>
+        <w:pStyle w:val="Heading2"/>
         <w:rPr>
           <w:lang w:val="en-US"/>
         </w:rPr>
       </w:pPr>
-      <w:bookmarkStart w:id="10" w:name="_Toc103675407"/>
+      <w:bookmarkStart w:id="12" w:name="_Toc103675407"/>
       <w:r>
         <w:rPr>
           <w:lang w:val="en-US"/>
@@ -1482,7 +1537,7 @@
         </w:rPr>
         <w:t>breaks</w:t>
       </w:r>
-      <w:bookmarkEnd w:id="10"/>
+      <w:bookmarkEnd w:id="12"/>
     </w:p>
     <w:p>
       <w:pPr>
@@ -1505,7 +1560,7 @@
       </w:r>
       <w:r>
         <w:rPr>
-          <w:rStyle w:val="Appelnotedebasdep"/>
+          <w:rStyle w:val="FootnoteReference"/>
           <w:lang w:val="en-US"/>
         </w:rPr>
         <w:footnoteReference w:id="2"/>
@@ -1576,7 +1631,7 @@
       </w:r>
       <w:r>
         <w:rPr>
-          <w:rStyle w:val="Appeldenotedefin"/>
+          <w:rStyle w:val="EndnoteReference"/>
           <w:lang w:val="en-US"/>
         </w:rPr>
         <w:endnoteReference w:id="1"/>
@@ -1674,12 +1729,12 @@
     </w:p>
     <w:p>
       <w:pPr>
-        <w:pStyle w:val="Titre1"/>
+        <w:pStyle w:val="Heading1"/>
         <w:rPr>
           <w:lang w:val="en-US"/>
         </w:rPr>
       </w:pPr>
-      <w:bookmarkStart w:id="11" w:name="_Toc103675408"/>
+      <w:bookmarkStart w:id="13" w:name="_Toc103675408"/>
       <w:r>
         <w:rPr>
           <w:lang w:val="en-US"/>
@@ -1687,23 +1742,23 @@
         <w:lastRenderedPageBreak/>
         <w:t>Eléments and objects</w:t>
       </w:r>
-      <w:bookmarkEnd w:id="11"/>
+      <w:bookmarkEnd w:id="13"/>
     </w:p>
     <w:p>
       <w:pPr>
-        <w:pStyle w:val="Titre2"/>
+        <w:pStyle w:val="Heading2"/>
         <w:rPr>
           <w:lang w:val="en-US"/>
         </w:rPr>
       </w:pPr>
-      <w:bookmarkStart w:id="12" w:name="_Toc103675409"/>
+      <w:bookmarkStart w:id="14" w:name="_Toc103675409"/>
       <w:r>
         <w:rPr>
           <w:lang w:val="en-US"/>
         </w:rPr>
         <w:t>Images</w:t>
       </w:r>
-      <w:bookmarkEnd w:id="12"/>
+      <w:bookmarkEnd w:id="14"/>
     </w:p>
     <w:p>
       <w:pPr>
@@ -1747,7 +1802,7 @@
                     </pic:cNvPicPr>
                   </pic:nvPicPr>
                   <pic:blipFill>
-                    <a:blip r:embed="rId8" cstate="print">
+                    <a:blip r:embed="rId9" cstate="print">
                       <a:extLst>
                         <a:ext uri="{28A0092B-C50C-407E-A947-70E740481C1C}">
                           <a14:useLocalDpi xmlns:a14="http://schemas.microsoft.com/office/drawing/2010/main" val="0"/>
@@ -1822,7 +1877,7 @@
                     </pic:cNvPicPr>
                   </pic:nvPicPr>
                   <pic:blipFill>
-                    <a:blip r:embed="rId9" cstate="print">
+                    <a:blip r:embed="rId10" cstate="print">
                       <a:extLst>
                         <a:ext uri="{28A0092B-C50C-407E-A947-70E740481C1C}">
                           <a14:useLocalDpi xmlns:a14="http://schemas.microsoft.com/office/drawing/2010/main" val="0"/>
@@ -1895,7 +1950,7 @@
                     </pic:cNvPicPr>
                   </pic:nvPicPr>
                   <pic:blipFill>
-                    <a:blip r:embed="rId10" cstate="print">
+                    <a:blip r:embed="rId11" cstate="print">
                       <a:extLst>
                         <a:ext uri="{28A0092B-C50C-407E-A947-70E740481C1C}">
                           <a14:useLocalDpi xmlns:a14="http://schemas.microsoft.com/office/drawing/2010/main" val="0"/>
@@ -1955,7 +2010,7 @@
                     </pic:cNvPicPr>
                   </pic:nvPicPr>
                   <pic:blipFill>
-                    <a:blip r:embed="rId11" cstate="print">
+                    <a:blip r:embed="rId12" cstate="print">
                       <a:extLst>
                         <a:ext uri="{28A0092B-C50C-407E-A947-70E740481C1C}">
                           <a14:useLocalDpi xmlns:a14="http://schemas.microsoft.com/office/drawing/2010/main" val="0"/>
@@ -2124,7 +2179,7 @@
                         <w:txbxContent>
                           <w:p>
                             <w:pPr>
-                              <w:pStyle w:val="Lgende"/>
+                              <w:pStyle w:val="Caption"/>
                               <w:rPr>
                                 <w:noProof/>
                               </w:rPr>
@@ -2237,7 +2292,7 @@
             <wp:cNvGraphicFramePr/>
             <a:graphic xmlns:a="http://schemas.openxmlformats.org/drawingml/2006/main">
               <a:graphicData uri="http://schemas.openxmlformats.org/drawingml/2006/diagram">
-                <dgm:relIds xmlns:dgm="http://schemas.openxmlformats.org/drawingml/2006/diagram" xmlns:r="http://schemas.openxmlformats.org/officeDocument/2006/relationships" r:dm="rId12" r:lo="rId13" r:qs="rId14" r:cs="rId15"/>
+                <dgm:relIds xmlns:dgm="http://schemas.openxmlformats.org/drawingml/2006/diagram" xmlns:r="http://schemas.openxmlformats.org/officeDocument/2006/relationships" r:dm="rId13" r:lo="rId14" r:qs="rId15" r:cs="rId16"/>
               </a:graphicData>
             </a:graphic>
           </wp:inline>
@@ -2246,7 +2301,7 @@
     </w:p>
     <w:p>
       <w:pPr>
-        <w:pStyle w:val="Lgende"/>
+        <w:pStyle w:val="Caption"/>
         <w:rPr>
           <w:lang w:val="en-US"/>
         </w:rPr>
@@ -2323,7 +2378,7 @@
             <wp:cNvGraphicFramePr/>
             <a:graphic xmlns:a="http://schemas.openxmlformats.org/drawingml/2006/main">
               <a:graphicData uri="http://schemas.openxmlformats.org/drawingml/2006/chart">
-                <c:chart xmlns:c="http://schemas.openxmlformats.org/drawingml/2006/chart" xmlns:r="http://schemas.openxmlformats.org/officeDocument/2006/relationships" r:id="rId17"/>
+                <c:chart xmlns:c="http://schemas.openxmlformats.org/drawingml/2006/chart" xmlns:r="http://schemas.openxmlformats.org/officeDocument/2006/relationships" r:id="rId18"/>
               </a:graphicData>
             </a:graphic>
           </wp:inline>
@@ -2332,19 +2387,19 @@
     </w:p>
     <w:p>
       <w:pPr>
-        <w:pStyle w:val="Titre2"/>
+        <w:pStyle w:val="Heading2"/>
         <w:rPr>
           <w:lang w:val="en-US"/>
         </w:rPr>
       </w:pPr>
-      <w:bookmarkStart w:id="13" w:name="_Toc103675410"/>
+      <w:bookmarkStart w:id="15" w:name="_Toc103675410"/>
       <w:r>
         <w:rPr>
           <w:lang w:val="en-US"/>
         </w:rPr>
         <w:t>Equations</w:t>
       </w:r>
-      <w:bookmarkEnd w:id="13"/>
+      <w:bookmarkEnd w:id="15"/>
     </w:p>
     <w:p>
       <w:pPr>
@@ -2360,7 +2415,7 @@
       </w:r>
       <w:r>
         <w:rPr>
-          <w:rStyle w:val="Appeldenotedefin"/>
+          <w:rStyle w:val="EndnoteReference"/>
           <w:lang w:val="en-US"/>
         </w:rPr>
         <w:endnoteReference w:id="2"/>
@@ -2573,19 +2628,19 @@
     </w:p>
     <w:p>
       <w:pPr>
-        <w:pStyle w:val="Titre2"/>
+        <w:pStyle w:val="Heading2"/>
         <w:rPr>
           <w:lang w:val="en-US"/>
         </w:rPr>
       </w:pPr>
-      <w:bookmarkStart w:id="14" w:name="_Toc103675411"/>
+      <w:bookmarkStart w:id="16" w:name="_Toc103675411"/>
       <w:r>
         <w:rPr>
           <w:lang w:val="en-US"/>
         </w:rPr>
         <w:t>Tables</w:t>
       </w:r>
-      <w:bookmarkEnd w:id="14"/>
+      <w:bookmarkEnd w:id="16"/>
     </w:p>
     <w:p>
       <w:pPr>
@@ -2608,7 +2663,7 @@
     </w:p>
     <w:tbl>
       <w:tblPr>
-        <w:tblStyle w:val="Tableausimple2"/>
+        <w:tblStyle w:val="PlainTable2"/>
         <w:tblW w:w="0" w:type="auto"/>
         <w:tblLook w:val="0420" w:firstRow="1" w:lastRow="0" w:firstColumn="0" w:lastColumn="0" w:noHBand="0" w:noVBand="1"/>
       </w:tblPr>
@@ -2971,7 +3026,7 @@
     </w:p>
     <w:tbl>
       <w:tblPr>
-        <w:tblStyle w:val="Tableausimple2"/>
+        <w:tblStyle w:val="PlainTable2"/>
         <w:tblW w:w="0" w:type="auto"/>
         <w:tblLook w:val="0420" w:firstRow="1" w:lastRow="0" w:firstColumn="0" w:lastColumn="0" w:noHBand="0" w:noVBand="1"/>
       </w:tblPr>
@@ -3314,7 +3369,7 @@
     </w:tbl>
     <w:p>
       <w:pPr>
-        <w:pStyle w:val="Lgende"/>
+        <w:pStyle w:val="Caption"/>
         <w:rPr>
           <w:rFonts w:asciiTheme="majorHAnsi" w:hAnsiTheme="majorHAnsi" w:cstheme="majorHAnsi"/>
           <w:lang w:val="en-US"/>
@@ -3397,7 +3452,7 @@
     </w:p>
     <w:tbl>
       <w:tblPr>
-        <w:tblStyle w:val="Tableausimple2"/>
+        <w:tblStyle w:val="PlainTable2"/>
         <w:tblW w:w="0" w:type="auto"/>
         <w:tblLook w:val="02A0" w:firstRow="1" w:lastRow="0" w:firstColumn="1" w:lastColumn="0" w:noHBand="1" w:noVBand="0"/>
       </w:tblPr>
@@ -3915,14 +3970,14 @@
   <w:endnote w:id="1">
     <w:p>
       <w:pPr>
-        <w:pStyle w:val="Notedefin"/>
+        <w:pStyle w:val="EndnoteText"/>
         <w:rPr>
           <w:lang w:val="en-US"/>
         </w:rPr>
       </w:pPr>
       <w:r>
         <w:rPr>
-          <w:rStyle w:val="Appeldenotedefin"/>
+          <w:rStyle w:val="EndnoteReference"/>
         </w:rPr>
         <w:endnoteRef/>
       </w:r>
@@ -3937,14 +3992,14 @@
   <w:endnote w:id="2">
     <w:p>
       <w:pPr>
-        <w:pStyle w:val="Notedefin"/>
+        <w:pStyle w:val="EndnoteText"/>
         <w:rPr>
           <w:vertAlign w:val="subscript"/>
         </w:rPr>
       </w:pPr>
       <w:r>
         <w:rPr>
-          <w:rStyle w:val="Appeldenotedefin"/>
+          <w:rStyle w:val="EndnoteReference"/>
         </w:rPr>
         <w:endnoteRef/>
       </w:r>
@@ -3970,7 +4025,7 @@
       <w:hyperlink r:id="rId1" w:history="1">
         <w:r>
           <w:rPr>
-            <w:rStyle w:val="Lienhypertexte"/>
+            <w:rStyle w:val="Hyperlink"/>
             <w:lang w:val="en-US"/>
           </w:rPr>
           <w:t>hyperlink</w:t>
@@ -4066,14 +4121,14 @@
   <w:footnote w:id="1">
     <w:p>
       <w:pPr>
-        <w:pStyle w:val="Notedebasdepage"/>
+        <w:pStyle w:val="FootnoteText"/>
         <w:rPr>
           <w:lang w:val="en-US"/>
         </w:rPr>
       </w:pPr>
       <w:r>
         <w:rPr>
-          <w:rStyle w:val="Appelnotedebasdep"/>
+          <w:rStyle w:val="FootnoteReference"/>
         </w:rPr>
         <w:footnoteRef/>
       </w:r>
@@ -4082,20 +4137,54 @@
           <w:lang w:val="en-US"/>
         </w:rPr>
         <w:t xml:space="preserve"> This is a simple footnote with some text</w:t>
+      </w:r>
+      <w:r>
+        <w:rPr>
+          <w:lang w:val="en-US"/>
+        </w:rPr>
+        <w:t xml:space="preserve"> and an abbreviation </w:t>
+      </w:r>
+      <w:bookmarkStart w:id="3" w:name="Abbreviations5555467692023640526"/>
+      <w:r>
+        <w:rPr>
+          <w:lang w:val="en-US"/>
+        </w:rPr>
+        <w:t>etc.</w:t>
+      </w:r>
+      <w:bookmarkEnd w:id="3"/>
+      <w:r>
+        <w:rPr>
+          <w:lang w:val="en-US"/>
+        </w:rPr>
+        <w:t xml:space="preserve"> and an acronym </w:t>
+      </w:r>
+      <w:bookmarkStart w:id="4" w:name="AcronymsNo5400092294780659364"/>
+      <w:r>
+        <w:rPr>
+          <w:lang w:val="en-US"/>
+        </w:rPr>
+        <w:t>T.T.</w:t>
+      </w:r>
+      <w:bookmarkEnd w:id="4"/>
+      <w:r>
+        <w:rPr>
+          <w:lang w:val="en-US"/>
+        </w:rPr>
+        <w:t xml:space="preserve"> in a footnote.</w:t>
       </w:r>
     </w:p>
   </w:footnote>
   <w:footnote w:id="2">
     <w:p>
       <w:pPr>
-        <w:pStyle w:val="Notedebasdepage"/>
+        <w:pStyle w:val="FootnoteText"/>
         <w:rPr>
           <w:lang w:val="en-US"/>
         </w:rPr>
       </w:pPr>
       <w:r>
         <w:rPr>
-          <w:rStyle w:val="Appelnotedebasdep"/>
+          <w:rStyle w:val="FootnoteReference"/>
         </w:rPr>
         <w:footnoteRef/>
       </w:r>
@@ -4108,7 +4197,7 @@
       <w:hyperlink r:id="rId1" w:history="1">
         <w:r>
           <w:rPr>
-            <w:rStyle w:val="Lienhypertexte"/>
+            <w:rStyle w:val="Hyperlink"/>
             <w:lang w:val="en-US"/>
           </w:rPr>
           <w:t>hyperlink</w:t>
@@ -4123,6 +4212,127 @@
     </w:p>
   </w:footnote>
 </w:footnotes>
+</file>
+
+<file path=word/numbering.xml><?xml version="1.0" encoding="utf-8"?>
+<w:numbering xmlns:wpc="http://schemas.microsoft.com/office/word/2010/wordprocessingCanvas" xmlns:cx="http://schemas.microsoft.com/office/drawing/2014/chartex" xmlns:cx1="http://schemas.microsoft.com/office/drawing/2015/9/8/chartex" xmlns:cx2="http://schemas.microsoft.com/office/drawing/2015/10/21/chartex" xmlns:cx3="http://schemas.microsoft.com/office/drawing/2016/5/9/chartex" xmlns:cx4="http://schemas.microsoft.com/office/drawing/2016/5/10/chartex" xmlns:cx5="http://schemas.microsoft.com/office/drawing/2016/5/11/chartex" xmlns:cx6="http://schemas.microsoft.com/office/drawing/2016/5/12/chartex" xmlns:cx7="http://schemas.microsoft.com/office/drawing/2016/5/13/chartex" xmlns:cx8="http://schemas.microsoft.com/office/drawing/2016/5/14/chartex" xmlns:mc="http://schemas.openxmlformats.org/markup-compatibility/2006" xmlns:aink="http://schemas.microsoft.com/office/drawing/2016/ink" xmlns:am3d="http://schemas.microsoft.com/office/drawing/2017/model3d" xmlns:o="urn:schemas-microsoft-com:office:office" xmlns:oel="http://schemas.microsoft.com/office/2019/extlst" xmlns:r="http://schemas.openxmlformats.org/officeDocument/2006/relationships" xmlns:m="http://schemas.openxmlformats.org/officeDocument/2006/math" xmlns:v="urn:schemas-microsoft-com:vml" xmlns:wp14="http://schemas.microsoft.com/office/word/2010/wordprocessingDrawing" xmlns:wp="http://schemas.openxmlformats.org/drawingml/2006/wordprocessingDrawing" xmlns:w10="urn:schemas-microsoft-com:office:word" xmlns:w="http://schemas.openxmlformats.org/wordprocessingml/2006/main" xmlns:w14="http://schemas.microsoft.com/office/word/2010/wordml" xmlns:w15="http://schemas.microsoft.com/office/word/2012/wordml" xmlns:w16cex="http://schemas.microsoft.com/office/word/2018/wordml/cex" xmlns:w16cid="http://schemas.microsoft.com/office/word/2016/wordml/cid" xmlns:w16="http://schemas.microsoft.com/office/word/2018/wordml" xmlns:w16du="http://schemas.microsoft.com/office/word/2023/wordml/word16du" xmlns:w16sdtdh="http://schemas.microsoft.com/office/word/2020/wordml/sdtdatahash" xmlns:w16sdtfl="http://schemas.microsoft.com/office/word/2024/wordml/sdtformatlock" xmlns:w16se="http://schemas.microsoft.com/office/word/2015/wordml/symex" xmlns:wpg="http://schemas.microsoft.com/office/word/2010/wordprocessingGroup" xmlns:wpi="http://schemas.microsoft.com/office/word/2010/wordprocessingInk" xmlns:wne="http://schemas.microsoft.com/office/word/2006/wordml" xmlns:wps="http://schemas.microsoft.com/office/word/2010/wordprocessingShape" mc:Ignorable="w14 w15 w16se w16cid w16 w16cex w16sdtdh w16sdtfl w16du wp14">
+  <w:abstractNum w:abstractNumId="0" w15:restartNumberingAfterBreak="0">
+    <w:nsid w:val="0F804D8E"/>
+    <w:multiLevelType w:val="hybridMultilevel"/>
+    <w:tmpl w:val="2048F604"/>
+    <w:lvl w:ilvl="0" w:tplc="040C0001">
+      <w:start w:val="1"/>
+      <w:numFmt w:val="bullet"/>
+      <w:lvlText w:val=""/>
+      <w:lvlJc w:val="left"/>
+      <w:pPr>
+        <w:ind w:left="720" w:hanging="360"/>
+      </w:pPr>
+      <w:rPr>
+        <w:rFonts w:ascii="Symbol" w:hAnsi="Symbol" w:hint="default"/>
+      </w:rPr>
+    </w:lvl>
+    <w:lvl w:ilvl="1" w:tplc="040C0003" w:tentative="1">
+      <w:start w:val="1"/>
+      <w:numFmt w:val="bullet"/>
+      <w:lvlText w:val="o"/>
+      <w:lvlJc w:val="left"/>
+      <w:pPr>
+        <w:ind w:left="1440" w:hanging="360"/>
+      </w:pPr>
+      <w:rPr>
+        <w:rFonts w:ascii="Courier New" w:hAnsi="Courier New" w:cs="Courier New" w:hint="default"/>
+      </w:rPr>
+    </w:lvl>
+    <w:lvl w:ilvl="2" w:tplc="040C0005" w:tentative="1">
+      <w:start w:val="1"/>
+      <w:numFmt w:val="bullet"/>
+      <w:lvlText w:val=""/>
+      <w:lvlJc w:val="left"/>
+      <w:pPr>
+        <w:ind w:left="2160" w:hanging="360"/>
+      </w:pPr>
+      <w:rPr>
+        <w:rFonts w:ascii="Wingdings" w:hAnsi="Wingdings" w:hint="default"/>
+      </w:rPr>
+    </w:lvl>
+    <w:lvl w:ilvl="3" w:tplc="040C0001" w:tentative="1">
+      <w:start w:val="1"/>
+      <w:numFmt w:val="bullet"/>
+      <w:lvlText w:val=""/>
+      <w:lvlJc w:val="left"/>
+      <w:pPr>
+        <w:ind w:left="2880" w:hanging="360"/>
+      </w:pPr>
+      <w:rPr>
+        <w:rFonts w:ascii="Symbol" w:hAnsi="Symbol" w:hint="default"/>
+      </w:rPr>
+    </w:lvl>
+    <w:lvl w:ilvl="4" w:tplc="040C0003" w:tentative="1">
+      <w:start w:val="1"/>
+      <w:numFmt w:val="bullet"/>
+      <w:lvlText w:val="o"/>
+      <w:lvlJc w:val="left"/>
+      <w:pPr>
+        <w:ind w:left="3600" w:hanging="360"/>
+      </w:pPr>
+      <w:rPr>
+        <w:rFonts w:ascii="Courier New" w:hAnsi="Courier New" w:cs="Courier New" w:hint="default"/>
+      </w:rPr>
+    </w:lvl>
+    <w:lvl w:ilvl="5" w:tplc="040C0005" w:tentative="1">
+      <w:start w:val="1"/>
+      <w:numFmt w:val="bullet"/>
+      <w:lvlText w:val=""/>
+      <w:lvlJc w:val="left"/>
+      <w:pPr>
+        <w:ind w:left="4320" w:hanging="360"/>
+      </w:pPr>
+      <w:rPr>
+        <w:rFonts w:ascii="Wingdings" w:hAnsi="Wingdings" w:hint="default"/>
+      </w:rPr>
+    </w:lvl>
+    <w:lvl w:ilvl="6" w:tplc="040C0001" w:tentative="1">
+      <w:start w:val="1"/>
+      <w:numFmt w:val="bullet"/>
+      <w:lvlText w:val=""/>
+      <w:lvlJc w:val="left"/>
+      <w:pPr>
+        <w:ind w:left="5040" w:hanging="360"/>
+      </w:pPr>
+      <w:rPr>
+        <w:rFonts w:ascii="Symbol" w:hAnsi="Symbol" w:hint="default"/>
+      </w:rPr>
+    </w:lvl>
+    <w:lvl w:ilvl="7" w:tplc="040C0003" w:tentative="1">
+      <w:start w:val="1"/>
+      <w:numFmt w:val="bullet"/>
+      <w:lvlText w:val="o"/>
+      <w:lvlJc w:val="left"/>
+      <w:pPr>
+        <w:ind w:left="5760" w:hanging="360"/>
+      </w:pPr>
+      <w:rPr>
+        <w:rFonts w:ascii="Courier New" w:hAnsi="Courier New" w:cs="Courier New" w:hint="default"/>
+      </w:rPr>
+    </w:lvl>
+    <w:lvl w:ilvl="8" w:tplc="040C0005" w:tentative="1">
+      <w:start w:val="1"/>
+      <w:numFmt w:val="bullet"/>
+      <w:lvlText w:val=""/>
+      <w:lvlJc w:val="left"/>
+      <w:pPr>
+        <w:ind w:left="6480" w:hanging="360"/>
+      </w:pPr>
+      <w:rPr>
+        <w:rFonts w:ascii="Wingdings" w:hAnsi="Wingdings" w:hint="default"/>
+      </w:rPr>
+    </w:lvl>
+  </w:abstractNum>
+  <w:num w:numId="1" w16cid:durableId="2024814765">
+    <w:abstractNumId w:val="0"/>
+  </w:num>
+</w:numbering>
 </file>
 
 <file path=word/styles.xml><?xml version="1.0" encoding="utf-8"?>
@@ -4524,11 +4734,11 @@
     <w:name w:val="Normal"/>
     <w:qFormat/>
   </w:style>
-  <w:style w:type="paragraph" w:styleId="Titre1">
+  <w:style w:type="paragraph" w:styleId="Heading1">
     <w:name w:val="heading 1"/>
     <w:basedOn w:val="Normal"/>
     <w:next w:val="Normal"/>
-    <w:link w:val="Titre1Car"/>
+    <w:link w:val="Heading1Char"/>
     <w:uiPriority w:val="9"/>
     <w:qFormat/>
     <w:rsid w:val="00AC1EF8"/>
@@ -4545,11 +4755,11 @@
       <w:szCs w:val="32"/>
     </w:rPr>
   </w:style>
-  <w:style w:type="paragraph" w:styleId="Titre2">
+  <w:style w:type="paragraph" w:styleId="Heading2">
     <w:name w:val="heading 2"/>
     <w:basedOn w:val="Normal"/>
     <w:next w:val="Normal"/>
-    <w:link w:val="Titre2Car"/>
+    <w:link w:val="Heading2Char"/>
     <w:uiPriority w:val="9"/>
     <w:unhideWhenUsed/>
     <w:qFormat/>
@@ -4567,13 +4777,13 @@
       <w:szCs w:val="26"/>
     </w:rPr>
   </w:style>
-  <w:style w:type="character" w:default="1" w:styleId="Policepardfaut">
+  <w:style w:type="character" w:default="1" w:styleId="DefaultParagraphFont">
     <w:name w:val="Default Paragraph Font"/>
     <w:uiPriority w:val="1"/>
     <w:semiHidden/>
     <w:unhideWhenUsed/>
   </w:style>
-  <w:style w:type="table" w:default="1" w:styleId="TableauNormal">
+  <w:style w:type="table" w:default="1" w:styleId="TableNormal">
     <w:name w:val="Normal Table"/>
     <w:uiPriority w:val="99"/>
     <w:semiHidden/>
@@ -4588,17 +4798,17 @@
       </w:tblCellMar>
     </w:tblPr>
   </w:style>
-  <w:style w:type="numbering" w:default="1" w:styleId="Aucuneliste">
+  <w:style w:type="numbering" w:default="1" w:styleId="NoList">
     <w:name w:val="No List"/>
     <w:uiPriority w:val="99"/>
     <w:semiHidden/>
     <w:unhideWhenUsed/>
   </w:style>
-  <w:style w:type="paragraph" w:styleId="Titre">
+  <w:style w:type="paragraph" w:styleId="Title">
     <w:name w:val="Title"/>
     <w:basedOn w:val="Normal"/>
     <w:next w:val="Normal"/>
-    <w:link w:val="TitreCar"/>
+    <w:link w:val="TitleChar"/>
     <w:uiPriority w:val="10"/>
     <w:qFormat/>
     <w:rsid w:val="00AC1EF8"/>
@@ -4614,10 +4824,10 @@
       <w:szCs w:val="56"/>
     </w:rPr>
   </w:style>
-  <w:style w:type="character" w:customStyle="1" w:styleId="TitreCar">
-    <w:name w:val="Titre Car"/>
-    <w:basedOn w:val="Policepardfaut"/>
-    <w:link w:val="Titre"/>
+  <w:style w:type="character" w:customStyle="1" w:styleId="TitleChar">
+    <w:name w:val="Title Char"/>
+    <w:basedOn w:val="DefaultParagraphFont"/>
+    <w:link w:val="Title"/>
     <w:uiPriority w:val="10"/>
     <w:rsid w:val="00AC1EF8"/>
     <w:rPr>
@@ -4645,10 +4855,10 @@
       <w:lang w:eastAsia="fr-FR"/>
     </w:rPr>
   </w:style>
-  <w:style w:type="character" w:customStyle="1" w:styleId="Titre1Car">
-    <w:name w:val="Titre 1 Car"/>
-    <w:basedOn w:val="Policepardfaut"/>
-    <w:link w:val="Titre1"/>
+  <w:style w:type="character" w:customStyle="1" w:styleId="Heading1Char">
+    <w:name w:val="Heading 1 Char"/>
+    <w:basedOn w:val="DefaultParagraphFont"/>
+    <w:link w:val="Heading1"/>
     <w:uiPriority w:val="9"/>
     <w:rsid w:val="00AC1EF8"/>
     <w:rPr>
@@ -4658,10 +4868,10 @@
       <w:szCs w:val="32"/>
     </w:rPr>
   </w:style>
-  <w:style w:type="character" w:customStyle="1" w:styleId="Titre2Car">
-    <w:name w:val="Titre 2 Car"/>
-    <w:basedOn w:val="Policepardfaut"/>
-    <w:link w:val="Titre2"/>
+  <w:style w:type="character" w:customStyle="1" w:styleId="Heading2Char">
+    <w:name w:val="Heading 2 Char"/>
+    <w:basedOn w:val="DefaultParagraphFont"/>
+    <w:link w:val="Heading2"/>
     <w:uiPriority w:val="9"/>
     <w:rsid w:val="00AC1EF8"/>
     <w:rPr>
@@ -4671,9 +4881,9 @@
       <w:szCs w:val="26"/>
     </w:rPr>
   </w:style>
-  <w:style w:type="paragraph" w:styleId="En-ttedetabledesmatires">
+  <w:style w:type="paragraph" w:styleId="TOCHeading">
     <w:name w:val="TOC Heading"/>
-    <w:basedOn w:val="Titre1"/>
+    <w:basedOn w:val="Heading1"/>
     <w:next w:val="Normal"/>
     <w:uiPriority w:val="39"/>
     <w:unhideWhenUsed/>
@@ -4686,7 +4896,7 @@
       <w:lang w:eastAsia="fr-FR"/>
     </w:rPr>
   </w:style>
-  <w:style w:type="paragraph" w:styleId="TM1">
+  <w:style w:type="paragraph" w:styleId="TOC1">
     <w:name w:val="toc 1"/>
     <w:basedOn w:val="Normal"/>
     <w:next w:val="Normal"/>
@@ -4698,7 +4908,7 @@
       <w:spacing w:after="100"/>
     </w:pPr>
   </w:style>
-  <w:style w:type="paragraph" w:styleId="TM2">
+  <w:style w:type="paragraph" w:styleId="TOC2">
     <w:name w:val="toc 2"/>
     <w:basedOn w:val="Normal"/>
     <w:next w:val="Normal"/>
@@ -4711,9 +4921,9 @@
       <w:ind w:left="220"/>
     </w:pPr>
   </w:style>
-  <w:style w:type="character" w:styleId="Lienhypertexte">
+  <w:style w:type="character" w:styleId="Hyperlink">
     <w:name w:val="Hyperlink"/>
-    <w:basedOn w:val="Policepardfaut"/>
+    <w:basedOn w:val="DefaultParagraphFont"/>
     <w:uiPriority w:val="99"/>
     <w:unhideWhenUsed/>
     <w:rsid w:val="000404D5"/>
@@ -4722,9 +4932,9 @@
       <w:u w:val="single"/>
     </w:rPr>
   </w:style>
-  <w:style w:type="table" w:styleId="Grilledutableau">
+  <w:style w:type="table" w:styleId="TableGrid">
     <w:name w:val="Table Grid"/>
-    <w:basedOn w:val="TableauNormal"/>
+    <w:basedOn w:val="TableNormal"/>
     <w:uiPriority w:val="39"/>
     <w:rsid w:val="00291576"/>
     <w:pPr>
@@ -4741,9 +4951,9 @@
       </w:tblBorders>
     </w:tblPr>
   </w:style>
-  <w:style w:type="table" w:styleId="Tableausimple2">
+  <w:style w:type="table" w:styleId="PlainTable2">
     <w:name w:val="Plain Table 2"/>
-    <w:basedOn w:val="TableauNormal"/>
+    <w:basedOn w:val="TableNormal"/>
     <w:uiPriority w:val="42"/>
     <w:rsid w:val="004E0CE5"/>
     <w:pPr>
@@ -4821,7 +5031,7 @@
       </w:tcPr>
     </w:tblStylePr>
   </w:style>
-  <w:style w:type="paragraph" w:styleId="Lgende">
+  <w:style w:type="paragraph" w:styleId="Caption">
     <w:name w:val="caption"/>
     <w:basedOn w:val="Normal"/>
     <w:next w:val="Normal"/>
@@ -4922,7 +5132,7 @@
   </w:style>
   <w:style w:type="character" w:customStyle="1" w:styleId="BodymatterDAISYChar">
     <w:name w:val="Bodymatter (DAISY) Char"/>
-    <w:basedOn w:val="Policepardfaut"/>
+    <w:basedOn w:val="DefaultParagraphFont"/>
     <w:link w:val="BodymatterDAISY"/>
     <w:rsid w:val="00472CC9"/>
     <w:rPr>
@@ -4965,7 +5175,7 @@
   </w:style>
   <w:style w:type="character" w:customStyle="1" w:styleId="CitationDAISY">
     <w:name w:val="Citation (DAISY)"/>
-    <w:basedOn w:val="Policepardfaut"/>
+    <w:basedOn w:val="DefaultParagraphFont"/>
     <w:rsid w:val="00472CC9"/>
     <w:rPr>
       <w:i/>
@@ -4973,7 +5183,7 @@
   </w:style>
   <w:style w:type="character" w:customStyle="1" w:styleId="CodeDAISY">
     <w:name w:val="Code (DAISY)"/>
-    <w:basedOn w:val="Policepardfaut"/>
+    <w:basedOn w:val="DefaultParagraphFont"/>
     <w:rsid w:val="00472CC9"/>
     <w:rPr>
       <w:rFonts w:ascii="Courier New" w:hAnsi="Courier New"/>
@@ -5009,7 +5219,7 @@
   </w:style>
   <w:style w:type="character" w:customStyle="1" w:styleId="DefinitionDAISY">
     <w:name w:val="Definition (DAISY)"/>
-    <w:basedOn w:val="Policepardfaut"/>
+    <w:basedOn w:val="DefaultParagraphFont"/>
     <w:rsid w:val="00472CC9"/>
     <w:rPr>
       <w:u w:val="single"/>
@@ -5033,7 +5243,7 @@
   </w:style>
   <w:style w:type="character" w:customStyle="1" w:styleId="DefinitionTermDAISY">
     <w:name w:val="Definition Term(DAISY)"/>
-    <w:basedOn w:val="Policepardfaut"/>
+    <w:basedOn w:val="DefaultParagraphFont"/>
     <w:uiPriority w:val="1"/>
     <w:qFormat/>
     <w:rsid w:val="00472CC9"/>
@@ -5107,7 +5317,7 @@
   </w:style>
   <w:style w:type="character" w:customStyle="1" w:styleId="FrontmatterDAISYChar">
     <w:name w:val="Frontmatter (DAISY) Char"/>
-    <w:basedOn w:val="Policepardfaut"/>
+    <w:basedOn w:val="DefaultParagraphFont"/>
     <w:link w:val="FrontmatterDAISY"/>
     <w:rsid w:val="00472CC9"/>
     <w:rPr>
@@ -5138,7 +5348,7 @@
   </w:style>
   <w:style w:type="character" w:customStyle="1" w:styleId="KeyboardInputDAISY">
     <w:name w:val="Keyboard Input (DAISY)"/>
-    <w:basedOn w:val="Policepardfaut"/>
+    <w:basedOn w:val="DefaultParagraphFont"/>
     <w:rsid w:val="00472CC9"/>
     <w:rPr>
       <w:rFonts w:ascii="Courier New" w:hAnsi="Courier New"/>
@@ -5148,7 +5358,7 @@
   </w:style>
   <w:style w:type="character" w:customStyle="1" w:styleId="LineNumberDAISY">
     <w:name w:val="Line Number(DAISY)"/>
-    <w:basedOn w:val="Policepardfaut"/>
+    <w:basedOn w:val="DefaultParagraphFont"/>
     <w:uiPriority w:val="1"/>
     <w:qFormat/>
     <w:rsid w:val="00472CC9"/>
@@ -5175,7 +5385,7 @@
   </w:style>
   <w:style w:type="character" w:customStyle="1" w:styleId="PageNumberDAISY">
     <w:name w:val="Page Number (DAISY)"/>
-    <w:basedOn w:val="Policepardfaut"/>
+    <w:basedOn w:val="DefaultParagraphFont"/>
     <w:rsid w:val="00472CC9"/>
     <w:rPr>
       <w:color w:val="FF0000"/>
@@ -5324,7 +5534,7 @@
   </w:style>
   <w:style w:type="character" w:customStyle="1" w:styleId="QuotationDAISY">
     <w:name w:val="Quotation (DAISY)"/>
-    <w:basedOn w:val="Policepardfaut"/>
+    <w:basedOn w:val="DefaultParagraphFont"/>
     <w:rsid w:val="00472CC9"/>
     <w:rPr>
       <w:i/>
@@ -5346,7 +5556,7 @@
   </w:style>
   <w:style w:type="character" w:customStyle="1" w:styleId="RearmatterDAISYChar">
     <w:name w:val="Rearmatter (DAISY) Char"/>
-    <w:basedOn w:val="Policepardfaut"/>
+    <w:basedOn w:val="DefaultParagraphFont"/>
     <w:link w:val="RearmatterDAISY"/>
     <w:rsid w:val="00472CC9"/>
     <w:rPr>
@@ -5356,7 +5566,7 @@
   </w:style>
   <w:style w:type="character" w:customStyle="1" w:styleId="SampleDAISY">
     <w:name w:val="Sample (DAISY)"/>
-    <w:basedOn w:val="Policepardfaut"/>
+    <w:basedOn w:val="DefaultParagraphFont"/>
     <w:rsid w:val="00472CC9"/>
     <w:rPr>
       <w:lang w:val="en-GB"/>
@@ -5364,7 +5574,7 @@
   </w:style>
   <w:style w:type="character" w:customStyle="1" w:styleId="SentDAISY">
     <w:name w:val="Sent(DAISY)"/>
-    <w:basedOn w:val="Policepardfaut"/>
+    <w:basedOn w:val="DefaultParagraphFont"/>
     <w:uiPriority w:val="1"/>
     <w:qFormat/>
     <w:rsid w:val="00472CC9"/>
@@ -5376,7 +5586,7 @@
   </w:style>
   <w:style w:type="character" w:customStyle="1" w:styleId="SpanDAISY">
     <w:name w:val="Span(DAISY)"/>
-    <w:basedOn w:val="Policepardfaut"/>
+    <w:basedOn w:val="DefaultParagraphFont"/>
     <w:uiPriority w:val="1"/>
     <w:qFormat/>
     <w:rsid w:val="00472CC9"/>
@@ -5405,7 +5615,7 @@
   </w:style>
   <w:style w:type="table" w:customStyle="1" w:styleId="Table-FooterDAISY">
     <w:name w:val="Table-Footer(DAISY)"/>
-    <w:basedOn w:val="Grilledutableau"/>
+    <w:basedOn w:val="TableGrid"/>
     <w:uiPriority w:val="99"/>
     <w:qFormat/>
     <w:rsid w:val="00472CC9"/>
@@ -5434,7 +5644,7 @@
   </w:style>
   <w:style w:type="character" w:customStyle="1" w:styleId="WordDAISY">
     <w:name w:val="Word(DAISY)"/>
-    <w:basedOn w:val="Policepardfaut"/>
+    <w:basedOn w:val="DefaultParagraphFont"/>
     <w:uiPriority w:val="1"/>
     <w:qFormat/>
     <w:rsid w:val="00472CC9"/>
@@ -5444,10 +5654,10 @@
       <w:sz w:val="24"/>
     </w:rPr>
   </w:style>
-  <w:style w:type="paragraph" w:styleId="Notedebasdepage">
+  <w:style w:type="paragraph" w:styleId="FootnoteText">
     <w:name w:val="footnote text"/>
     <w:basedOn w:val="Normal"/>
-    <w:link w:val="NotedebasdepageCar"/>
+    <w:link w:val="FootnoteTextChar"/>
     <w:uiPriority w:val="99"/>
     <w:semiHidden/>
     <w:unhideWhenUsed/>
@@ -5460,10 +5670,10 @@
       <w:szCs w:val="20"/>
     </w:rPr>
   </w:style>
-  <w:style w:type="character" w:customStyle="1" w:styleId="NotedebasdepageCar">
-    <w:name w:val="Note de bas de page Car"/>
-    <w:basedOn w:val="Policepardfaut"/>
-    <w:link w:val="Notedebasdepage"/>
+  <w:style w:type="character" w:customStyle="1" w:styleId="FootnoteTextChar">
+    <w:name w:val="Footnote Text Char"/>
+    <w:basedOn w:val="DefaultParagraphFont"/>
+    <w:link w:val="FootnoteText"/>
     <w:uiPriority w:val="99"/>
     <w:semiHidden/>
     <w:rsid w:val="00861239"/>
@@ -5472,9 +5682,9 @@
       <w:szCs w:val="20"/>
     </w:rPr>
   </w:style>
-  <w:style w:type="character" w:styleId="Appelnotedebasdep">
+  <w:style w:type="character" w:styleId="FootnoteReference">
     <w:name w:val="footnote reference"/>
-    <w:basedOn w:val="Policepardfaut"/>
+    <w:basedOn w:val="DefaultParagraphFont"/>
     <w:uiPriority w:val="99"/>
     <w:semiHidden/>
     <w:unhideWhenUsed/>
@@ -5483,9 +5693,9 @@
       <w:vertAlign w:val="superscript"/>
     </w:rPr>
   </w:style>
-  <w:style w:type="character" w:styleId="Mentionnonrsolue">
+  <w:style w:type="character" w:styleId="UnresolvedMention">
     <w:name w:val="Unresolved Mention"/>
-    <w:basedOn w:val="Policepardfaut"/>
+    <w:basedOn w:val="DefaultParagraphFont"/>
     <w:uiPriority w:val="99"/>
     <w:semiHidden/>
     <w:unhideWhenUsed/>
@@ -5495,9 +5705,9 @@
       <w:shd w:val="clear" w:color="auto" w:fill="E1DFDD"/>
     </w:rPr>
   </w:style>
-  <w:style w:type="character" w:styleId="Lienhypertextesuivivisit">
+  <w:style w:type="character" w:styleId="FollowedHyperlink">
     <w:name w:val="FollowedHyperlink"/>
-    <w:basedOn w:val="Policepardfaut"/>
+    <w:basedOn w:val="DefaultParagraphFont"/>
     <w:uiPriority w:val="99"/>
     <w:semiHidden/>
     <w:unhideWhenUsed/>
@@ -5507,10 +5717,10 @@
       <w:u w:val="single"/>
     </w:rPr>
   </w:style>
-  <w:style w:type="paragraph" w:styleId="Notedefin">
+  <w:style w:type="paragraph" w:styleId="EndnoteText">
     <w:name w:val="endnote text"/>
     <w:basedOn w:val="Normal"/>
-    <w:link w:val="NotedefinCar"/>
+    <w:link w:val="EndnoteTextChar"/>
     <w:uiPriority w:val="99"/>
     <w:semiHidden/>
     <w:unhideWhenUsed/>
@@ -5523,10 +5733,10 @@
       <w:szCs w:val="20"/>
     </w:rPr>
   </w:style>
-  <w:style w:type="character" w:customStyle="1" w:styleId="NotedefinCar">
-    <w:name w:val="Note de fin Car"/>
-    <w:basedOn w:val="Policepardfaut"/>
-    <w:link w:val="Notedefin"/>
+  <w:style w:type="character" w:customStyle="1" w:styleId="EndnoteTextChar">
+    <w:name w:val="Endnote Text Char"/>
+    <w:basedOn w:val="DefaultParagraphFont"/>
+    <w:link w:val="EndnoteText"/>
     <w:uiPriority w:val="99"/>
     <w:semiHidden/>
     <w:rsid w:val="009658C7"/>
@@ -5535,9 +5745,9 @@
       <w:szCs w:val="20"/>
     </w:rPr>
   </w:style>
-  <w:style w:type="character" w:styleId="Appeldenotedefin">
+  <w:style w:type="character" w:styleId="EndnoteReference">
     <w:name w:val="endnote reference"/>
-    <w:basedOn w:val="Policepardfaut"/>
+    <w:basedOn w:val="DefaultParagraphFont"/>
     <w:uiPriority w:val="99"/>
     <w:semiHidden/>
     <w:unhideWhenUsed/>
@@ -5614,13 +5824,24 @@
       <w:u w:val="single"/>
     </w:rPr>
   </w:style>
+  <w:style w:type="paragraph" w:styleId="ListParagraph">
+    <w:name w:val="List Paragraph"/>
+    <w:basedOn w:val="Normal"/>
+    <w:uiPriority w:val="34"/>
+    <w:qFormat/>
+    <w:rsid w:val="004E5AEA"/>
+    <w:pPr>
+      <w:ind w:left="720"/>
+      <w:contextualSpacing/>
+    </w:pPr>
+  </w:style>
 </w:styles>
 </file>
 
 <file path=word/charts/chart1.xml><?xml version="1.0" encoding="utf-8"?>
 <c:chartSpace xmlns:c="http://schemas.openxmlformats.org/drawingml/2006/chart" xmlns:a="http://schemas.openxmlformats.org/drawingml/2006/main" xmlns:r="http://schemas.openxmlformats.org/officeDocument/2006/relationships" xmlns:c16r2="http://schemas.microsoft.com/office/drawing/2015/06/chart">
   <c:date1904 val="0"/>
-  <c:lang val="fr-FR"/>
+  <c:lang val="en-US"/>
   <c:roundedCorners val="0"/>
   <mc:AlternateContent xmlns:mc="http://schemas.openxmlformats.org/markup-compatibility/2006">
     <mc:Choice xmlns:c14="http://schemas.microsoft.com/office/drawing/2007/8/2/chart" Requires="c14">
@@ -7561,7 +7782,7 @@
   <dgm:whole/>
   <dgm:extLst>
     <a:ext uri="http://schemas.microsoft.com/office/drawing/2008/diagram">
-      <dsp:dataModelExt xmlns:dsp="http://schemas.microsoft.com/office/drawing/2008/diagram" relId="rId16" minVer="http://schemas.openxmlformats.org/drawingml/2006/diagram"/>
+      <dsp:dataModelExt xmlns:dsp="http://schemas.microsoft.com/office/drawing/2008/diagram" relId="rId17" minVer="http://schemas.openxmlformats.org/drawingml/2006/diagram"/>
     </a:ext>
   </dgm:extLst>
 </dgm:dataModel>
@@ -9445,11 +9666,13 @@
     <Item AbbreviationName="Abbreviations4687551102882176760" FullAbbr="Et Alimony" OriginalText="etal."/>
     <Item AbbreviationName="Abbreviations5019654367602899514" FullAbbr="et caetera" OriginalText="etc."/>
     <Item AbbreviationName="Abbreviations5377627517227795381" FullAbbr="et caetera" OriginalText="etc."/>
+    <Item AbbreviationName="Abbreviations5555467692023640526" FullAbbr="etcaetera" OriginalText="etc."/>
   </Abbreviations>
   <Acronyms>
     <Item AcronymName="AcronymsYes5217018880860573923" FullAcr="Institute of Electrical and Electronic Engineers" OriginalText="IEEE"/>
     <Item AcronymName="AcronymsYes5703539723210207112" FullAcr="Institute of Electrical and Electronic Engineers" OriginalText="IEEE"/>
     <Item AcronymName="AcronymsYes4986238613562909951" FullAcr="Digital Accessible Information System" OriginalText="DAISY"/>
+    <Item AcronymName="AcronymsNo5400092294780659364" FullAcr="Time Travel" OriginalText="T.T."/>
   </Acronyms>
 </Manage>
 </file>
@@ -9463,7 +9686,7 @@
 </file>
 
 <file path=customXml/itemProps2.xml><?xml version="1.0" encoding="utf-8"?>
-<ds:datastoreItem xmlns:ds="http://schemas.openxmlformats.org/officeDocument/2006/customXml" ds:itemID="{E73164F4-65B2-4B8D-BB0F-DA226291539F}">
+<ds:datastoreItem xmlns:ds="http://schemas.openxmlformats.org/officeDocument/2006/customXml" ds:itemID="{C74442D8-3FE4-406F-858C-D95076610E13}">
   <ds:schemaRefs>
     <ds:schemaRef ds:uri="http://Daisy-OpenXML/customxml"/>
   </ds:schemaRefs>

</xml_diff>

<commit_message>
word-to-dtbook: fix error in PictureLanguage template for table captions
The first language code in the sequence is returned in case there are multiple.

fixes https://github.com/daisy/pipeline/issues/903

Also includes:

- Improved handling of character styles for tables captions.
- Fix handling of the "Epigraph - Author (DAISY)" style.
- Renaming of "OpenStyleTagIfNotOpened" template to "OpenStyleTag" for
  simplification.
</commit_message>
<xml_diff>
--- a/word-to-dtbook/src/test/resources/Test 11/Input/default_sample_for_dtbook_conversion.docx
+++ b/word-to-dtbook/src/test/resources/Test 11/Input/default_sample_for_dtbook_conversion.docx
@@ -1323,13 +1323,170 @@
     </w:p>
     <w:p>
       <w:pPr>
+        <w:pStyle w:val="Heading2"/>
+        <w:rPr>
+          <w:lang w:val="en-US"/>
+        </w:rPr>
+      </w:pPr>
+      <w:r>
+        <w:rPr>
+          <w:lang w:val="en-US"/>
+        </w:rPr>
+        <w:t xml:space="preserve">Testing </w:t>
+      </w:r>
+      <w:r>
+        <w:rPr>
+          <w:lang w:val="en-US"/>
+        </w:rPr>
+        <w:t>special blocks</w:t>
+      </w:r>
+    </w:p>
+    <w:p>
+      <w:pPr>
+        <w:pStyle w:val="NormalWeb"/>
+        <w:rPr>
+          <w:rFonts w:asciiTheme="majorHAnsi" w:hAnsiTheme="majorHAnsi" w:cstheme="majorHAnsi"/>
+          <w:lang w:val="en-US"/>
+        </w:rPr>
+      </w:pPr>
+      <w:r>
+        <w:rPr>
+          <w:rFonts w:asciiTheme="majorHAnsi" w:hAnsiTheme="majorHAnsi" w:cstheme="majorHAnsi"/>
+          <w:lang w:val="en-US"/>
+        </w:rPr>
+        <w:t>This is a paragraph</w:t>
+      </w:r>
+    </w:p>
+    <w:p>
+      <w:pPr>
+        <w:pStyle w:val="Sidebarheader-OptionalDAISY"/>
+      </w:pPr>
+      <w:r>
+        <w:t>This is a head for</w:t>
+      </w:r>
+    </w:p>
+    <w:p>
+      <w:pPr>
+        <w:pStyle w:val="Sidebar-OptionalDAISY"/>
+      </w:pPr>
+      <w:r>
+        <w:t>a sidebar optional</w:t>
+      </w:r>
+    </w:p>
+    <w:p>
+      <w:pPr>
+        <w:pStyle w:val="Sidebarheader-RequiredDAISY"/>
+      </w:pPr>
+      <w:r>
+        <w:t>This is a head for</w:t>
+      </w:r>
+    </w:p>
+    <w:p>
+      <w:pPr>
+        <w:pStyle w:val="Sidebar-RequiredDAISY"/>
+      </w:pPr>
+      <w:r>
+        <w:t>a sidebar required</w:t>
+      </w:r>
+    </w:p>
+    <w:p>
+      <w:pPr>
+        <w:pStyle w:val="PoemDAISY"/>
+      </w:pPr>
+      <w:r>
+        <w:t>This is a simple poem.</w:t>
+      </w:r>
+    </w:p>
+    <w:p>
+      <w:pPr>
+        <w:pStyle w:val="PoemDAISY"/>
+      </w:pPr>
+      <w:r>
+        <w:t>With 2 lines of texte.</w:t>
+      </w:r>
+    </w:p>
+    <w:p>
+      <w:pPr>
+        <w:pStyle w:val="NormalWeb"/>
+        <w:rPr>
+          <w:rFonts w:asciiTheme="majorHAnsi" w:hAnsiTheme="majorHAnsi" w:cstheme="majorHAnsi"/>
+          <w:lang w:val="en-US"/>
+        </w:rPr>
+      </w:pPr>
+      <w:r>
+        <w:rPr>
+          <w:rFonts w:asciiTheme="majorHAnsi" w:hAnsiTheme="majorHAnsi" w:cstheme="majorHAnsi"/>
+          <w:lang w:val="en-US"/>
+        </w:rPr>
+        <w:lastRenderedPageBreak/>
+        <w:t>A paragraphe</w:t>
+      </w:r>
+    </w:p>
+    <w:p>
+      <w:pPr>
+        <w:pStyle w:val="Sidebar-OptionalDAISY"/>
+      </w:pPr>
+      <w:r>
+        <w:t>A sidebar</w:t>
+      </w:r>
+    </w:p>
+    <w:p>
+      <w:pPr>
+        <w:pStyle w:val="BridgeheadDAISY"/>
+      </w:pPr>
+      <w:r>
+        <w:t>Followed by a bridgehead</w:t>
+      </w:r>
+    </w:p>
+    <w:p>
+      <w:pPr>
+        <w:pStyle w:val="NormalWeb"/>
+        <w:rPr>
+          <w:rFonts w:asciiTheme="majorHAnsi" w:hAnsiTheme="majorHAnsi" w:cstheme="majorHAnsi"/>
+          <w:lang w:val="en-US"/>
+        </w:rPr>
+      </w:pPr>
+      <w:r>
+        <w:rPr>
+          <w:rFonts w:asciiTheme="majorHAnsi" w:hAnsiTheme="majorHAnsi" w:cstheme="majorHAnsi"/>
+          <w:lang w:val="en-US"/>
+        </w:rPr>
+        <w:t>A separation paragrpahe.</w:t>
+      </w:r>
+    </w:p>
+    <w:p>
+      <w:pPr>
+        <w:pStyle w:val="Sidebar-OptionalDAISY"/>
+      </w:pPr>
+      <w:r>
+        <w:t>This is a sidebar as last element</w:t>
+      </w:r>
+    </w:p>
+    <w:p>
+      <w:pPr>
+        <w:rPr>
+          <w:lang w:val="en-US"/>
+        </w:rPr>
+      </w:pPr>
+      <w:r>
+        <w:rPr>
+          <w:lang w:val="en-US"/>
+        </w:rPr>
+        <w:t>Testing blockquotes</w:t>
+      </w:r>
+      <w:r>
+        <w:rPr>
+          <w:lang w:val="en-US"/>
+        </w:rPr>
+        <w:t>:</w:t>
+      </w:r>
+    </w:p>
+    <w:p>
+      <w:pPr>
         <w:pStyle w:val="BlockquoteDAISY"/>
       </w:pPr>
       <w:r>
-        <w:t>This is a simple quote</w:t>
-      </w:r>
-      <w:r>
-        <w:t xml:space="preserve"> for testing</w:t>
+        <w:t>This is a simple quote for testing</w:t>
       </w:r>
     </w:p>
     <w:p>
@@ -1377,144 +1534,52 @@
       </w:r>
     </w:p>
     <w:p>
-      <w:pPr>
-        <w:pStyle w:val="Heading2"/>
-        <w:rPr>
-          <w:lang w:val="en-US"/>
-        </w:rPr>
-      </w:pPr>
-      <w:r>
-        <w:rPr>
-          <w:lang w:val="en-US"/>
-        </w:rPr>
-        <w:t xml:space="preserve">Testing </w:t>
-      </w:r>
-      <w:r>
-        <w:rPr>
-          <w:lang w:val="en-US"/>
-        </w:rPr>
-        <w:t>special blocks</w:t>
+      <w:r>
+        <w:t>Testing epigraphs :</w:t>
       </w:r>
     </w:p>
     <w:p>
       <w:pPr>
-        <w:pStyle w:val="NormalWeb"/>
-        <w:rPr>
-          <w:rFonts w:asciiTheme="majorHAnsi" w:hAnsiTheme="majorHAnsi" w:cstheme="majorHAnsi"/>
-          <w:lang w:val="en-US"/>
-        </w:rPr>
+        <w:pStyle w:val="EpigraphDAISY"/>
       </w:pPr>
       <w:r>
-        <w:rPr>
-          <w:rFonts w:asciiTheme="majorHAnsi" w:hAnsiTheme="majorHAnsi" w:cstheme="majorHAnsi"/>
-          <w:lang w:val="en-US"/>
-        </w:rPr>
-        <w:t>This is a paragraph</w:t>
+        <w:t>This is a simple epigraph test that i’m writing.</w:t>
       </w:r>
     </w:p>
     <w:p>
       <w:pPr>
-        <w:pStyle w:val="Sidebarheader-OptionalDAISY"/>
+        <w:pStyle w:val="EpigraphDAISY"/>
+        <w:rPr>
+          <w:lang w:val="en-US"/>
+        </w:rPr>
       </w:pPr>
       <w:r>
-        <w:t>This is a head for</w:t>
+        <w:rPr>
+          <w:lang w:val="en-US"/>
+        </w:rPr>
+        <w:t>In creating, the only hard thing’s to begin : a grass blade’s no easier to make than an oak</w:t>
+      </w:r>
+      <w:r>
+        <w:rPr>
+          <w:lang w:val="en-US"/>
+        </w:rPr>
+        <w:t>.</w:t>
       </w:r>
     </w:p>
     <w:p>
       <w:pPr>
-        <w:pStyle w:val="Sidebar-OptionalDAISY"/>
+        <w:pStyle w:val="EpigraphDAISY"/>
+        <w:rPr>
+          <w:lang w:val="en-US"/>
+        </w:rPr>
       </w:pPr>
-      <w:r>
-        <w:t>a sidebar optional</w:t>
-      </w:r>
     </w:p>
     <w:p>
       <w:pPr>
-        <w:pStyle w:val="Sidebarheader-RequiredDAISY"/>
+        <w:pStyle w:val="Epigraph-AuthorDAISY"/>
       </w:pPr>
       <w:r>
-        <w:lastRenderedPageBreak/>
-        <w:t>This is a head for</w:t>
-      </w:r>
-    </w:p>
-    <w:p>
-      <w:pPr>
-        <w:pStyle w:val="Sidebar-RequiredDAISY"/>
-      </w:pPr>
-      <w:r>
-        <w:t>a sidebar required</w:t>
-      </w:r>
-    </w:p>
-    <w:p>
-      <w:pPr>
-        <w:pStyle w:val="PoemDAISY"/>
-      </w:pPr>
-      <w:r>
-        <w:t>This is a simple poem.</w:t>
-      </w:r>
-    </w:p>
-    <w:p>
-      <w:pPr>
-        <w:pStyle w:val="PoemDAISY"/>
-      </w:pPr>
-      <w:r>
-        <w:t>With 2 lines of texte.</w:t>
-      </w:r>
-    </w:p>
-    <w:p>
-      <w:pPr>
-        <w:pStyle w:val="NormalWeb"/>
-        <w:rPr>
-          <w:rFonts w:asciiTheme="majorHAnsi" w:hAnsiTheme="majorHAnsi" w:cstheme="majorHAnsi"/>
-          <w:lang w:val="en-US"/>
-        </w:rPr>
-      </w:pPr>
-      <w:r>
-        <w:rPr>
-          <w:rFonts w:asciiTheme="majorHAnsi" w:hAnsiTheme="majorHAnsi" w:cstheme="majorHAnsi"/>
-          <w:lang w:val="en-US"/>
-        </w:rPr>
-        <w:t>A paragraphe</w:t>
-      </w:r>
-    </w:p>
-    <w:p>
-      <w:pPr>
-        <w:pStyle w:val="Sidebar-OptionalDAISY"/>
-      </w:pPr>
-      <w:r>
-        <w:t>A sidebar</w:t>
-      </w:r>
-    </w:p>
-    <w:p>
-      <w:pPr>
-        <w:pStyle w:val="BridgeheadDAISY"/>
-      </w:pPr>
-      <w:r>
-        <w:t>Followed by a bridgehead</w:t>
-      </w:r>
-    </w:p>
-    <w:p>
-      <w:pPr>
-        <w:pStyle w:val="NormalWeb"/>
-        <w:rPr>
-          <w:rFonts w:asciiTheme="majorHAnsi" w:hAnsiTheme="majorHAnsi" w:cstheme="majorHAnsi"/>
-          <w:lang w:val="en-US"/>
-        </w:rPr>
-      </w:pPr>
-      <w:r>
-        <w:rPr>
-          <w:rFonts w:asciiTheme="majorHAnsi" w:hAnsiTheme="majorHAnsi" w:cstheme="majorHAnsi"/>
-          <w:lang w:val="en-US"/>
-        </w:rPr>
-        <w:t>A separation paragrpahe.</w:t>
-      </w:r>
-    </w:p>
-    <w:p>
-      <w:pPr>
-        <w:pStyle w:val="Sidebar-OptionalDAISY"/>
-      </w:pPr>
-      <w:r>
-        <w:t>This is a sidebar as last element</w:t>
+        <w:t>James Russel Lowel, A Fable for Critics.</w:t>
       </w:r>
     </w:p>
     <w:p>
@@ -2221,7 +2286,7 @@
                   <w:txbxContent>
                     <w:p>
                       <w:pPr>
-                        <w:pStyle w:val="Lgende"/>
+                        <w:pStyle w:val="Caption"/>
                         <w:rPr>
                           <w:noProof/>
                         </w:rPr>
@@ -2384,6 +2449,388 @@
           </wp:inline>
         </w:drawing>
       </w:r>
+    </w:p>
+    <w:p>
+      <w:pPr>
+        <w:rPr>
+          <w:lang w:val="en-US"/>
+        </w:rPr>
+      </w:pPr>
+    </w:p>
+    <w:p>
+      <w:pPr>
+        <w:rPr>
+          <w:lang w:val="en-US"/>
+        </w:rPr>
+      </w:pPr>
+      <w:r>
+        <w:rPr>
+          <w:noProof/>
+          <w:lang w:val="en-US"/>
+        </w:rPr>
+        <mc:AlternateContent>
+          <mc:Choice Requires="wpg">
+            <w:drawing>
+              <wp:anchor distT="0" distB="0" distL="114300" distR="114300" simplePos="0" relativeHeight="251662336" behindDoc="0" locked="0" layoutInCell="1" allowOverlap="1" wp14:anchorId="04BD48C4" wp14:editId="3B3DA114">
+                <wp:simplePos x="0" y="0"/>
+                <wp:positionH relativeFrom="column">
+                  <wp:posOffset>-25</wp:posOffset>
+                </wp:positionH>
+                <wp:positionV relativeFrom="paragraph">
+                  <wp:posOffset>283261</wp:posOffset>
+                </wp:positionV>
+                <wp:extent cx="914400" cy="2747645"/>
+                <wp:effectExtent l="0" t="0" r="0" b="0"/>
+                <wp:wrapTopAndBottom/>
+                <wp:docPr id="1543439750" name="Group 6"/>
+                <wp:cNvGraphicFramePr/>
+                <a:graphic xmlns:a="http://schemas.openxmlformats.org/drawingml/2006/main">
+                  <a:graphicData uri="http://schemas.microsoft.com/office/word/2010/wordprocessingGroup">
+                    <wpg:wgp>
+                      <wpg:cNvGrpSpPr/>
+                      <wpg:grpSpPr>
+                        <a:xfrm>
+                          <a:off x="0" y="0"/>
+                          <a:ext cx="914400" cy="2747645"/>
+                          <a:chOff x="0" y="0"/>
+                          <a:chExt cx="914400" cy="2747645"/>
+                        </a:xfrm>
+                      </wpg:grpSpPr>
+                      <wpg:grpSp>
+                        <wpg:cNvPr id="2089066700" name="Group 5" descr="Testing alt text"/>
+                        <wpg:cNvGrpSpPr/>
+                        <wpg:grpSpPr>
+                          <a:xfrm>
+                            <a:off x="0" y="0"/>
+                            <a:ext cx="730885" cy="1955165"/>
+                            <a:chOff x="-3" y="0"/>
+                            <a:chExt cx="731523" cy="1955520"/>
+                          </a:xfrm>
+                        </wpg:grpSpPr>
+                        <pic:pic xmlns:pic="http://schemas.openxmlformats.org/drawingml/2006/picture">
+                          <pic:nvPicPr>
+                            <pic:cNvPr id="1322608943" name="Image 1" descr="The daisy consortium logo"/>
+                            <pic:cNvPicPr>
+                              <a:picLocks noChangeAspect="1"/>
+                            </pic:cNvPicPr>
+                          </pic:nvPicPr>
+                          <pic:blipFill>
+                            <a:blip r:embed="rId19" cstate="print">
+                              <a:extLst>
+                                <a:ext uri="{28A0092B-C50C-407E-A947-70E740481C1C}">
+                                  <a14:useLocalDpi xmlns:a14="http://schemas.microsoft.com/office/drawing/2010/main" val="0"/>
+                                </a:ext>
+                              </a:extLst>
+                            </a:blip>
+                            <a:srcRect/>
+                            <a:stretch>
+                              <a:fillRect/>
+                            </a:stretch>
+                          </pic:blipFill>
+                          <pic:spPr bwMode="auto">
+                            <a:xfrm>
+                              <a:off x="0" y="0"/>
+                              <a:ext cx="731520" cy="653415"/>
+                            </a:xfrm>
+                            <a:prstGeom prst="rect">
+                              <a:avLst/>
+                            </a:prstGeom>
+                            <a:noFill/>
+                            <a:ln>
+                              <a:noFill/>
+                            </a:ln>
+                          </pic:spPr>
+                        </pic:pic>
+                        <pic:pic xmlns:pic="http://schemas.openxmlformats.org/drawingml/2006/picture">
+                          <pic:nvPicPr>
+                            <pic:cNvPr id="1303198031" name="Image 1" descr="The daisy consortium logo"/>
+                            <pic:cNvPicPr>
+                              <a:picLocks noChangeAspect="1"/>
+                            </pic:cNvPicPr>
+                          </pic:nvPicPr>
+                          <pic:blipFill>
+                            <a:blip r:embed="rId9" cstate="print">
+                              <a:extLst>
+                                <a:ext uri="{28A0092B-C50C-407E-A947-70E740481C1C}">
+                                  <a14:useLocalDpi xmlns:a14="http://schemas.microsoft.com/office/drawing/2010/main" val="0"/>
+                                </a:ext>
+                              </a:extLst>
+                            </a:blip>
+                            <a:srcRect/>
+                            <a:stretch>
+                              <a:fillRect/>
+                            </a:stretch>
+                          </pic:blipFill>
+                          <pic:spPr bwMode="auto">
+                            <a:xfrm>
+                              <a:off x="0" y="651053"/>
+                              <a:ext cx="731520" cy="653415"/>
+                            </a:xfrm>
+                            <a:prstGeom prst="rect">
+                              <a:avLst/>
+                            </a:prstGeom>
+                            <a:noFill/>
+                            <a:ln>
+                              <a:noFill/>
+                            </a:ln>
+                          </pic:spPr>
+                        </pic:pic>
+                        <pic:pic xmlns:pic="http://schemas.openxmlformats.org/drawingml/2006/picture">
+                          <pic:nvPicPr>
+                            <pic:cNvPr id="54848344" name="Image 1" descr="The daisy consortium logo"/>
+                            <pic:cNvPicPr>
+                              <a:picLocks noChangeAspect="1"/>
+                            </pic:cNvPicPr>
+                          </pic:nvPicPr>
+                          <pic:blipFill>
+                            <a:blip r:embed="rId9" cstate="print">
+                              <a:extLst>
+                                <a:ext uri="{28A0092B-C50C-407E-A947-70E740481C1C}">
+                                  <a14:useLocalDpi xmlns:a14="http://schemas.microsoft.com/office/drawing/2010/main" val="0"/>
+                                </a:ext>
+                              </a:extLst>
+                            </a:blip>
+                            <a:srcRect/>
+                            <a:stretch>
+                              <a:fillRect/>
+                            </a:stretch>
+                          </pic:blipFill>
+                          <pic:spPr bwMode="auto">
+                            <a:xfrm>
+                              <a:off x="-3" y="1302105"/>
+                              <a:ext cx="731520" cy="653415"/>
+                            </a:xfrm>
+                            <a:prstGeom prst="rect">
+                              <a:avLst/>
+                            </a:prstGeom>
+                            <a:noFill/>
+                            <a:ln>
+                              <a:noFill/>
+                            </a:ln>
+                          </pic:spPr>
+                        </pic:pic>
+                      </wpg:grpSp>
+                      <wps:wsp>
+                        <wps:cNvPr id="521272629" name="Text Box 1"/>
+                        <wps:cNvSpPr txBox="1"/>
+                        <wps:spPr>
+                          <a:xfrm>
+                            <a:off x="0" y="2011680"/>
+                            <a:ext cx="914400" cy="735965"/>
+                          </a:xfrm>
+                          <a:prstGeom prst="rect">
+                            <a:avLst/>
+                          </a:prstGeom>
+                          <a:solidFill>
+                            <a:prstClr val="white"/>
+                          </a:solidFill>
+                          <a:ln>
+                            <a:noFill/>
+                          </a:ln>
+                        </wps:spPr>
+                        <wps:txbx>
+                          <w:txbxContent>
+                            <w:p>
+                              <w:pPr>
+                                <w:pStyle w:val="Caption"/>
+                                <w:rPr>
+                                  <w:lang w:val="en-US"/>
+                                </w:rPr>
+                              </w:pPr>
+                              <w:r>
+                                <w:rPr>
+                                  <w:lang w:val="en-US"/>
+                                </w:rPr>
+                                <w:t xml:space="preserve">Figure </w:t>
+                              </w:r>
+                              <w:r>
+                                <w:fldChar w:fldCharType="begin"/>
+                              </w:r>
+                              <w:r>
+                                <w:rPr>
+                                  <w:lang w:val="en-US"/>
+                                </w:rPr>
+                                <w:instrText xml:space="preserve"> SEQ Figure \* ARABIC </w:instrText>
+                              </w:r>
+                              <w:r>
+                                <w:fldChar w:fldCharType="separate"/>
+                              </w:r>
+                              <w:r>
+                                <w:rPr>
+                                  <w:noProof/>
+                                  <w:lang w:val="en-US"/>
+                                </w:rPr>
+                                <w:t>1</w:t>
+                              </w:r>
+                              <w:r>
+                                <w:rPr>
+                                  <w:noProof/>
+                                </w:rPr>
+                                <w:fldChar w:fldCharType="end"/>
+                              </w:r>
+                              <w:r>
+                                <w:rPr>
+                                  <w:lang w:val="en-US"/>
+                                </w:rPr>
+                                <w:t xml:space="preserve"> – a captio</w:t>
+                              </w:r>
+                              <w:r>
+                                <w:rPr>
+                                  <w:lang w:val="en-US"/>
+                                </w:rPr>
+                                <w:t>n</w:t>
+                              </w:r>
+                            </w:p>
+                            <w:p>
+                              <w:pPr>
+                                <w:rPr>
+                                  <w:lang w:val="en-US"/>
+                                </w:rPr>
+                              </w:pPr>
+                              <w:r>
+                                <w:rPr>
+                                  <w:lang w:val="en-US"/>
+                                </w:rPr>
+                                <w:t>And other things</w:t>
+                              </w:r>
+                            </w:p>
+                          </w:txbxContent>
+                        </wps:txbx>
+                        <wps:bodyPr rot="0" spcFirstLastPara="0" vertOverflow="overflow" horzOverflow="overflow" vert="horz" wrap="square" lIns="0" tIns="0" rIns="0" bIns="0" numCol="1" spcCol="0" rtlCol="0" fromWordArt="0" anchor="t" anchorCtr="0" forceAA="0" compatLnSpc="1">
+                          <a:prstTxWarp prst="textNoShape">
+                            <a:avLst/>
+                          </a:prstTxWarp>
+                          <a:spAutoFit/>
+                        </wps:bodyPr>
+                      </wps:wsp>
+                    </wpg:wgp>
+                  </a:graphicData>
+                </a:graphic>
+              </wp:anchor>
+            </w:drawing>
+          </mc:Choice>
+          <mc:Fallback>
+            <w:pict>
+              <v:group w14:anchorId="04BD48C4" id="Group 6" o:spid="_x0000_s1027" style="position:absolute;margin-left:0;margin-top:22.3pt;width:1in;height:216.35pt;z-index:251662336;mso-position-horizontal-relative:text;mso-position-vertical-relative:text" coordsize="9144,27476" o:gfxdata="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">
+                <v:group id="Group 5" o:spid="_x0000_s1028" alt="Testing alt text" style="position:absolute;width:7308;height:19551" coordorigin="" coordsize="7315,19555" o:gfxdata="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">
+                  <v:shapetype id="_x0000_t75" coordsize="21600,21600" o:spt="75" o:preferrelative="t" path="m@4@5l@4@11@9@11@9@5xe" filled="f" stroked="f">
+                    <v:stroke joinstyle="miter"/>
+                    <v:formulas>
+                      <v:f eqn="if lineDrawn pixelLineWidth 0"/>
+                      <v:f eqn="sum @0 1 0"/>
+                      <v:f eqn="sum 0 0 @1"/>
+                      <v:f eqn="prod @2 1 2"/>
+                      <v:f eqn="prod @3 21600 pixelWidth"/>
+                      <v:f eqn="prod @3 21600 pixelHeight"/>
+                      <v:f eqn="sum @0 0 1"/>
+                      <v:f eqn="prod @6 1 2"/>
+                      <v:f eqn="prod @7 21600 pixelWidth"/>
+                      <v:f eqn="sum @8 21600 0"/>
+                      <v:f eqn="prod @7 21600 pixelHeight"/>
+                      <v:f eqn="sum @10 21600 0"/>
+                    </v:formulas>
+                    <v:path o:extrusionok="f" gradientshapeok="t" o:connecttype="rect"/>
+                    <o:lock v:ext="edit" aspectratio="t"/>
+                  </v:shapetype>
+                  <v:shape id="Image 1" o:spid="_x0000_s1029" type="#_x0000_t75" alt="The daisy consortium logo" style="position:absolute;width:7315;height:6534;visibility:visible;mso-wrap-style:square" o:gfxdata="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">
+                    <v:imagedata r:id="rId20" o:title="The daisy consortium logo"/>
+                  </v:shape>
+                  <v:shape id="Image 1" o:spid="_x0000_s1030" type="#_x0000_t75" alt="The daisy consortium logo" style="position:absolute;top:6510;width:7315;height:6534;visibility:visible;mso-wrap-style:square" o:gfxdata="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">
+                    <v:imagedata r:id="rId21" o:title="The daisy consortium logo"/>
+                  </v:shape>
+                  <v:shape id="Image 1" o:spid="_x0000_s1031" type="#_x0000_t75" alt="The daisy consortium logo" style="position:absolute;top:13021;width:7315;height:6534;visibility:visible;mso-wrap-style:square" o:gfxdata="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">
+                    <v:imagedata r:id="rId21" o:title="The daisy consortium logo"/>
+                  </v:shape>
+                </v:group>
+                <v:shape id="Text Box 1" o:spid="_x0000_s1032" type="#_x0000_t202" style="position:absolute;top:20116;width:9144;height:7360;visibility:visible;mso-wrap-style:square;v-text-anchor:top" o:gfxdata="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" stroked="f">
+                  <v:textbox style="mso-fit-shape-to-text:t" inset="0,0,0,0">
+                    <w:txbxContent>
+                      <w:p>
+                        <w:pPr>
+                          <w:pStyle w:val="Caption"/>
+                          <w:rPr>
+                            <w:lang w:val="en-US"/>
+                          </w:rPr>
+                        </w:pPr>
+                        <w:r>
+                          <w:rPr>
+                            <w:lang w:val="en-US"/>
+                          </w:rPr>
+                          <w:t xml:space="preserve">Figure </w:t>
+                        </w:r>
+                        <w:r>
+                          <w:fldChar w:fldCharType="begin"/>
+                        </w:r>
+                        <w:r>
+                          <w:rPr>
+                            <w:lang w:val="en-US"/>
+                          </w:rPr>
+                          <w:instrText xml:space="preserve"> SEQ Figure \* ARABIC </w:instrText>
+                        </w:r>
+                        <w:r>
+                          <w:fldChar w:fldCharType="separate"/>
+                        </w:r>
+                        <w:r>
+                          <w:rPr>
+                            <w:noProof/>
+                            <w:lang w:val="en-US"/>
+                          </w:rPr>
+                          <w:t>1</w:t>
+                        </w:r>
+                        <w:r>
+                          <w:rPr>
+                            <w:noProof/>
+                          </w:rPr>
+                          <w:fldChar w:fldCharType="end"/>
+                        </w:r>
+                        <w:r>
+                          <w:rPr>
+                            <w:lang w:val="en-US"/>
+                          </w:rPr>
+                          <w:t xml:space="preserve"> – a captio</w:t>
+                        </w:r>
+                        <w:r>
+                          <w:rPr>
+                            <w:lang w:val="en-US"/>
+                          </w:rPr>
+                          <w:t>n</w:t>
+                        </w:r>
+                      </w:p>
+                      <w:p>
+                        <w:pPr>
+                          <w:rPr>
+                            <w:lang w:val="en-US"/>
+                          </w:rPr>
+                        </w:pPr>
+                        <w:r>
+                          <w:rPr>
+                            <w:lang w:val="en-US"/>
+                          </w:rPr>
+                          <w:t>And other things</w:t>
+                        </w:r>
+                      </w:p>
+                    </w:txbxContent>
+                  </v:textbox>
+                </v:shape>
+                <w10:wrap type="topAndBottom"/>
+              </v:group>
+            </w:pict>
+          </mc:Fallback>
+        </mc:AlternateContent>
+      </w:r>
+      <w:r>
+        <w:rPr>
+          <w:lang w:val="en-US"/>
+        </w:rPr>
+        <w:t>Trying image groups with languages</w:t>
+      </w:r>
+    </w:p>
+    <w:p>
+      <w:pPr>
+        <w:rPr>
+          <w:lang w:val="en-US"/>
+        </w:rPr>
+      </w:pPr>
     </w:p>
     <w:p>
       <w:pPr>
@@ -2472,7 +2919,21 @@
                       <w:rFonts w:ascii="Cambria Math" w:hAnsi="Cambria Math"/>
                       <w:lang w:val="en-US"/>
                     </w:rPr>
-                    <m:t>x+a</m:t>
+                    <m:t>x</m:t>
+                  </m:r>
+                  <m:r>
+                    <w:rPr>
+                      <w:rFonts w:ascii="Cambria Math" w:hAnsi="Cambria Math"/>
+                      <w:lang w:val="en-US"/>
+                    </w:rPr>
+                    <m:t>+</m:t>
+                  </m:r>
+                  <m:r>
+                    <w:rPr>
+                      <w:rFonts w:ascii="Cambria Math" w:hAnsi="Cambria Math"/>
+                      <w:lang w:val="en-US"/>
+                    </w:rPr>
+                    <m:t>a</m:t>
                   </m:r>
                 </m:e>
               </m:d>
@@ -2511,7 +2972,14 @@
                   <w:rFonts w:ascii="Cambria Math" w:eastAsia="Cambria Math" w:hAnsi="Cambria Math" w:cs="Cambria Math"/>
                   <w:lang w:val="en-US"/>
                 </w:rPr>
-                <m:t>k=0</m:t>
+                <m:t>k</m:t>
+              </m:r>
+              <m:r>
+                <w:rPr>
+                  <w:rFonts w:ascii="Cambria Math" w:eastAsia="Cambria Math" w:hAnsi="Cambria Math" w:cs="Cambria Math"/>
+                  <w:lang w:val="en-US"/>
+                </w:rPr>
+                <m:t>=0</m:t>
               </m:r>
             </m:sub>
             <m:sup>
@@ -2617,7 +3085,21 @@
                       <w:rFonts w:ascii="Cambria Math" w:eastAsia="Cambria Math" w:hAnsi="Cambria Math" w:cs="Cambria Math"/>
                       <w:lang w:val="en-US"/>
                     </w:rPr>
-                    <m:t>n-k</m:t>
+                    <m:t>n</m:t>
+                  </m:r>
+                  <m:r>
+                    <w:rPr>
+                      <w:rFonts w:ascii="Cambria Math" w:eastAsia="Cambria Math" w:hAnsi="Cambria Math" w:cs="Cambria Math"/>
+                      <w:lang w:val="en-US"/>
+                    </w:rPr>
+                    <m:t>-</m:t>
+                  </m:r>
+                  <m:r>
+                    <w:rPr>
+                      <w:rFonts w:ascii="Cambria Math" w:eastAsia="Cambria Math" w:hAnsi="Cambria Math" w:cs="Cambria Math"/>
+                      <w:lang w:val="en-US"/>
+                    </w:rPr>
+                    <m:t>k</m:t>
                   </m:r>
                 </m:sup>
               </m:sSup>
@@ -2852,6 +3334,7 @@
                 <w:rFonts w:asciiTheme="majorHAnsi" w:hAnsiTheme="majorHAnsi" w:cstheme="majorHAnsi"/>
                 <w:lang w:val="en-US"/>
               </w:rPr>
+              <w:lastRenderedPageBreak/>
               <w:t>ty</w:t>
             </w:r>
           </w:p>
@@ -3371,7 +3854,7 @@
       <w:pPr>
         <w:pStyle w:val="Caption"/>
         <w:rPr>
-          <w:rFonts w:asciiTheme="majorHAnsi" w:hAnsiTheme="majorHAnsi" w:cstheme="majorHAnsi"/>
+          <w:noProof/>
           <w:lang w:val="en-US"/>
         </w:rPr>
       </w:pPr>
@@ -3416,35 +3899,72 @@
     </w:p>
     <w:p>
       <w:pPr>
-        <w:rPr>
-          <w:rFonts w:asciiTheme="majorHAnsi" w:hAnsiTheme="majorHAnsi" w:cstheme="majorHAnsi"/>
+        <w:pStyle w:val="Caption"/>
+        <w:rPr>
           <w:lang w:val="en-US"/>
         </w:rPr>
       </w:pPr>
       <w:r>
         <w:rPr>
-          <w:rFonts w:asciiTheme="majorHAnsi" w:hAnsiTheme="majorHAnsi" w:cstheme="majorHAnsi"/>
           <w:lang w:val="en-US"/>
         </w:rPr>
         <w:t>This is a table with header</w:t>
       </w:r>
       <w:r>
         <w:rPr>
-          <w:rFonts w:asciiTheme="majorHAnsi" w:hAnsiTheme="majorHAnsi" w:cstheme="majorHAnsi"/>
-          <w:lang w:val="en-US"/>
-        </w:rPr>
-        <w:t>s on row and</w:t>
-      </w:r>
-      <w:r>
-        <w:rPr>
-          <w:rFonts w:asciiTheme="majorHAnsi" w:hAnsiTheme="majorHAnsi" w:cstheme="majorHAnsi"/>
+          <w:lang w:val="en-US"/>
+        </w:rPr>
+        <w:t>s</w:t>
+      </w:r>
+      <w:r>
+        <w:rPr>
+          <w:lang w:val="en-US"/>
+        </w:rPr>
+        <w:t xml:space="preserve"> </w:t>
+      </w:r>
+      <w:r>
+        <w:rPr>
+          <w:i w:val="0"/>
+          <w:iCs w:val="0"/>
+        </w:rPr>
+        <w:t>entête</w:t>
+      </w:r>
+      <w:r>
+        <w:rPr>
+          <w:lang w:val="en-US"/>
+        </w:rPr>
+        <w:t xml:space="preserve"> on row and</w:t>
+      </w:r>
+      <w:r>
+        <w:rPr>
           <w:lang w:val="en-US"/>
         </w:rPr>
         <w:t xml:space="preserve"> column</w:t>
       </w:r>
       <w:r>
         <w:rPr>
-          <w:rFonts w:asciiTheme="majorHAnsi" w:hAnsiTheme="majorHAnsi" w:cstheme="majorHAnsi"/>
+          <w:lang w:val="en-US"/>
+        </w:rPr>
+        <w:t xml:space="preserve"> and several </w:t>
+      </w:r>
+      <w:r>
+        <w:rPr>
+          <w:i w:val="0"/>
+          <w:iCs w:val="0"/>
+        </w:rPr>
+        <w:t>langage</w:t>
+      </w:r>
+      <w:r>
+        <w:t xml:space="preserve"> </w:t>
+      </w:r>
+      <w:r>
+        <w:rPr>
+          <w:lang w:val="en-US"/>
+        </w:rPr>
+        <w:t>marked.</w:t>
+      </w:r>
+      <w:r>
+        <w:rPr>
           <w:lang w:val="en-US"/>
         </w:rPr>
         <w:t xml:space="preserve"> </w:t>
@@ -4733,6 +5253,7 @@
   <w:style w:type="paragraph" w:default="1" w:styleId="Normal">
     <w:name w:val="Normal"/>
     <w:qFormat/>
+    <w:rsid w:val="00074DD7"/>
   </w:style>
   <w:style w:type="paragraph" w:styleId="Heading1">
     <w:name w:val="heading 1"/>

</xml_diff>